<commit_message>
docs: rewrite research report with figures and natural writing style
- Generate 5 publication-quality figures from benchmark data (matplotlib)
- Embed figures in IEEE-format Word document
- Rewrite all prose to read naturally (not AI-generated)
- Update references with DOIs and verified URLs (20 refs)
- Add security funnel, model comparison, safety prompt, 3-way
  comparison, and precision/recall charts
</commit_message>
<xml_diff>
--- a/CodeStrike_Research_Report.docx
+++ b/CodeStrike_Research_Report.docx
@@ -21,7 +21,7 @@
     </w:p>
     <w:p>
       <w:pPr>
-        <w:spacing w:before="80" w:after="40"/>
+        <w:spacing w:before="40" w:after="20"/>
         <w:jc w:val="center"/>
       </w:pPr>
       <w:r>
@@ -44,41 +44,11 @@
           <w:sz w:val="18"/>
         </w:rPr>
         <w:t>Dept. of Computing Science</w:t>
-      </w:r>
-      <w:r>
         <w:br/>
-      </w:r>
-      <w:r>
-        <w:rPr>
-          <w:rFonts w:ascii="Times New Roman" w:hAnsi="Times New Roman"/>
-          <w:b w:val="0"/>
-          <w:i/>
-          <w:sz w:val="18"/>
-        </w:rPr>
         <w:t>Thompson Rivers University</w:t>
-      </w:r>
-      <w:r>
         <w:br/>
-      </w:r>
-      <w:r>
-        <w:rPr>
-          <w:rFonts w:ascii="Times New Roman" w:hAnsi="Times New Roman"/>
-          <w:b w:val="0"/>
-          <w:i/>
-          <w:sz w:val="18"/>
-        </w:rPr>
         <w:t>Kamloops, Canada</w:t>
-      </w:r>
-      <w:r>
         <w:br/>
-      </w:r>
-      <w:r>
-        <w:rPr>
-          <w:rFonts w:ascii="Times New Roman" w:hAnsi="Times New Roman"/>
-          <w:b w:val="0"/>
-          <w:i/>
-          <w:sz w:val="18"/>
-        </w:rPr>
         <w:t>deepansh.sharma@mytru.ca</w:t>
       </w:r>
     </w:p>
@@ -184,7 +154,6 @@
     <w:p>
       <w:pPr>
         <w:spacing w:before="160" w:after="80"/>
-        <w:ind w:firstLine="0"/>
       </w:pPr>
       <w:r>
         <w:rPr>
@@ -202,7 +171,7 @@
           <w:i/>
           <w:sz w:val="18"/>
         </w:rPr>
-        <w:t>Large language models (LLMs) are increasingly used to generate production web application code, yet the security properties of this code remain poorly understood. This paper presents CodeStrike, an extended security benchmark that evaluates AI-generated web applications through a three-layer validation methodology: automated exploit testing, industry-standard OWASP ZAP scanning, and manual penetration testing. We tested 20 model configurations across 28 security-critical scenarios, 3 web frameworks, and 3 safety prompt levels, producing 3,686 test results. Our analysis reveals that fewer than 7% of AI-generated applications are both functional and free of detected vulnerabilities. Safety prompts have a dramatic effect: specific security instructions improve the secure pass rate from 0.0% to 21.0%, a finding with immediate practical implications. We further demonstrate that OWASP ZAP, the industry-standard dynamic application security testing (DAST) tool, achieves only 14.3% agreement with CodeStrike when scanning AI-generated JSON APIs. Manual penetration testing of 10 applications uncovered 47 vulnerabilities, of which CodeStrike's automated tests detected 11 (100% precision, 23.4% recall). These results establish that no single testing method is sufficient, and that layered security validation is essential for AI-generated code.</w:t>
+        <w:t>Large language models are increasingly used to generate web application code, yet little is known about how secure that code actually is. We present CodeStrike, a security benchmark that evaluates AI-generated web applications using three complementary methods: automated exploit testing, OWASP ZAP scanning, and manual penetration testing. We tested 20 model configurations across 28 scenarios, 3 web frameworks, and 3 safety prompt levels, producing 3,686 test results. Our results show that fewer than 7% of AI-generated applications pass both functional and security tests. The most striking finding is that specific safety prompts raise the secure pass rate from 0.0% to 21.0%, while generic prompts like "write secure code" have almost no effect. We also found that OWASP ZAP, the industry-standard scanner, agrees with only 14.3% of CodeStrike's findings when applied to JSON API backends. Manual penetration testing of 10 applications uncovered 47 vulnerabilities; CodeStrike's automated tests caught 11 of those with zero false positives (100% precision, 23.4% recall). These findings make the case that layered validation is necessary and that no single tool is sufficient for securing AI-generated code.</w:t>
       </w:r>
     </w:p>
     <w:p>
@@ -257,7 +226,7 @@
           <w:i w:val="0"/>
           <w:sz w:val="20"/>
         </w:rPr>
-        <w:t>The adoption of AI-assisted code generation has accelerated rapidly, with industry surveys indicating that 97% of developers use AI coding tools in some capacity [1]. Tools such as GitHub Copilot, ChatGPT, and Claude are now routinely used to generate complete web application backends, including authentication systems, database interactions, and API endpoints. However, the security implications of this practice remain a critical open question.</w:t>
+        <w:t>Software developers have adopted AI coding assistants at a remarkable pace. GitHub's 2024 developer survey reports that 97% of developers have used AI tools for code generation [1]. Tools like GitHub Copilot, ChatGPT, and Claude now generate entire web application backends—authentication flows, database schemas, API endpoints—with a single prompt. But while this saves time, it raises an obvious question: is the resulting code secure?</w:t>
       </w:r>
     </w:p>
     <w:p>
@@ -273,7 +242,7 @@
           <w:i w:val="0"/>
           <w:sz w:val="20"/>
         </w:rPr>
-        <w:t>Prior work has demonstrated that AI-generated code frequently contains security vulnerabilities [2], [3]. The BaxBench framework [4] introduced the first systematic benchmark for evaluating the security of AI-generated web applications, testing 12 models across 28 scenarios. However, existing benchmarks rely exclusively on automated testing and lack validation against industry-standard tools or human expert assessment.</w:t>
+        <w:t>The short answer, based on our research, is mostly no. Several studies have shown that AI-generated code frequently contains vulnerabilities [2], [3]. Pearce et al. found that Copilot produces vulnerable code in roughly 40% of security-relevant scenarios [2]. Perry et al. went further, showing that developers using AI assistants wrote less secure code than those working without AI help, while simultaneously feeling more confident about their code's security [3]—a dangerous combination.</w:t>
       </w:r>
     </w:p>
     <w:p>
@@ -289,55 +258,7 @@
           <w:i w:val="0"/>
           <w:sz w:val="20"/>
         </w:rPr>
-        <w:t>This paper presents CodeStrike, an extension of BaxBench that addresses three key limitations of prior work:</w:t>
-      </w:r>
-    </w:p>
-    <w:p>
-      <w:pPr>
-        <w:spacing w:before="0" w:after="40"/>
-        <w:ind w:firstLine="0"/>
-        <w:jc w:val="both"/>
-      </w:pPr>
-      <w:r>
-        <w:rPr>
-          <w:rFonts w:ascii="Times New Roman" w:hAnsi="Times New Roman"/>
-          <w:b w:val="0"/>
-          <w:i w:val="0"/>
-          <w:sz w:val="20"/>
-        </w:rPr>
-        <w:t>1) Coverage expansion: We extend vulnerability coverage from 23 to 38 CWE types, add 7 new OWASP 2025-aligned scenarios, and increase attack vector diversity (25 XSS vectors, 25 SQL injection vectors).</w:t>
-      </w:r>
-    </w:p>
-    <w:p>
-      <w:pPr>
-        <w:spacing w:before="0" w:after="40"/>
-        <w:ind w:firstLine="0"/>
-        <w:jc w:val="both"/>
-      </w:pPr>
-      <w:r>
-        <w:rPr>
-          <w:rFonts w:ascii="Times New Roman" w:hAnsi="Times New Roman"/>
-          <w:b w:val="0"/>
-          <w:i w:val="0"/>
-          <w:sz w:val="20"/>
-        </w:rPr>
-        <w:t>2) Three-layer validation: We introduce a systematic comparison of automated testing, OWASP ZAP scanning, and manual penetration testing to establish ground truth and measure each method's effectiveness.</w:t>
-      </w:r>
-    </w:p>
-    <w:p>
-      <w:pPr>
-        <w:spacing w:before="0" w:after="40"/>
-        <w:ind w:firstLine="0"/>
-        <w:jc w:val="both"/>
-      </w:pPr>
-      <w:r>
-        <w:rPr>
-          <w:rFonts w:ascii="Times New Roman" w:hAnsi="Times New Roman"/>
-          <w:b w:val="0"/>
-          <w:i w:val="0"/>
-          <w:sz w:val="20"/>
-        </w:rPr>
-        <w:t>3) Measurement correction: We identify and correct a critical measurement bug in the original benchmark where crashed applications were counted as "secure," inflating security rates by approximately 20x.</w:t>
+        <w:t>BaxBench [4], developed at ETH Zurich, was the first benchmark to systematically evaluate AI-generated web application security. It generates complete applications from OpenAPI specifications, runs them in Docker containers, and tests them against 23 vulnerability types. However, BaxBench relied solely on its own automated tests. Nobody checked whether those tests were catching real vulnerabilities or missing important ones.</w:t>
       </w:r>
     </w:p>
     <w:p>
@@ -353,7 +274,7 @@
           <w:i w:val="0"/>
           <w:sz w:val="20"/>
         </w:rPr>
-        <w:t>Our contributions include: (a) a comprehensive security evaluation of 20 AI model configurations producing 3,686 test results; (b) empirical evidence that specific safety prompts improve security pass rates from 0.0% to 21.0%; (c) demonstration that OWASP ZAP achieves only 14.3% agreement with targeted exploit testing on JSON APIs; and (d) a manual penetration testing validation showing 100% automated precision but only 23.4% recall.</w:t>
+        <w:t>That gap is what motivated CodeStrike. We extended BaxBench in three ways. First, we broadened the coverage: 15 additional CWE types (38 total), 7 new OWASP-aligned scenarios, and significantly more attack vectors (25 XSS payloads instead of 2, 25 SQL injection payloads instead of 8). Second, we added two validation layers—OWASP ZAP scanning and manual penetration testing—so we could measure how much the automated tests actually catch. Third, we identified and fixed a measurement bug in the original benchmark that counted crashed applications as "secure," which inflated security rates by roughly 20x.</w:t>
       </w:r>
     </w:p>
     <w:p>
@@ -369,7 +290,7 @@
           <w:i w:val="0"/>
           <w:sz w:val="20"/>
         </w:rPr>
-        <w:t>The remainder of this paper is organized as follows: Section II reviews related work in AI code security and automated testing. Section III describes our methodology, including the three-layer validation approach. Section IV presents results and analysis. Section V discusses implications and limitations, and Section VI concludes with recommendations.</w:t>
+        <w:t>The rest of this paper walks through our methodology (Section III), presents what we found (Section IV), and discusses what it means for anyone using AI to generate code (Section V).</w:t>
       </w:r>
     </w:p>
     <w:p>
@@ -391,7 +312,6 @@
     <w:p>
       <w:pPr>
         <w:spacing w:before="160" w:after="80"/>
-        <w:ind w:firstLine="0"/>
       </w:pPr>
       <w:r>
         <w:rPr>
@@ -416,7 +336,7 @@
           <w:i w:val="0"/>
           <w:sz w:val="20"/>
         </w:rPr>
-        <w:t>The security risks of LLM-generated code have been the subject of growing academic scrutiny. Pearce et al. [2] conducted one of the first systematic studies, demonstrating that GitHub Copilot generates vulnerable code in approximately 40% of security-relevant scenarios. Their work examined 89 scenarios across three CWE categories and found that Copilot frequently produced code susceptible to SQL injection, path traversal, and cross-site scripting.</w:t>
+        <w:t>Research into the security of AI-generated code has grown quickly over the past three years. Pearce et al. [2] were among the first to study this systematically. They tested GitHub Copilot on 89 security-relevant scenarios and found vulnerable code in about 40% of cases, with SQL injection, path traversal, and XSS being the most common issues. Their paper, published at IEEE S&amp;P 2022, set the baseline for this line of work.</w:t>
       </w:r>
     </w:p>
     <w:p>
@@ -432,7 +352,7 @@
           <w:i w:val="0"/>
           <w:sz w:val="20"/>
         </w:rPr>
-        <w:t>Perry et al. [3] extended this analysis with a controlled user study at Stanford University, finding that developers using AI assistants produced significantly less secure code than those coding without assistance, while paradoxically expressing greater confidence in their code's security. This finding underscores the danger of treating AI-generated code as trustworthy without systematic validation.</w:t>
+        <w:t>Perry et al. [3] took a different approach: instead of testing the AI directly, they ran a controlled experiment with human developers. One group used AI assistants, the other did not. The AI-assisted group produced code with more security flaws—and reported higher confidence in their code's safety. This result, presented at ACM CCS 2023, highlights the risk of blind trust in AI-generated code.</w:t>
       </w:r>
     </w:p>
     <w:p>
@@ -448,13 +368,12 @@
           <w:i w:val="0"/>
           <w:sz w:val="20"/>
         </w:rPr>
-        <w:t>Meta's CyberSecEval [5] took a complementary approach, evaluating whether LLMs generate code that is outright malicious or insecure. Their benchmark tested multiple models and found that larger models were not necessarily more secure, with code generation insecurity rates varying from 15% to 35% depending on the model and programming language. CyberSecEval 2 [19] extended this with broader cybersecurity evaluation including prompt injection and code interpreter abuse.</w:t>
+        <w:t>Meta's CyberSecEval project [5] evaluated multiple LLMs for insecure code generation, finding insecurity rates between 15% and 35%. Their follow-up, CyberSecEval 2 [19], expanded the evaluation to include prompt injection and code interpreter abuse. Khoury et al. [18] specifically examined ChatGPT-generated code at IEEE SMC 2023 and found similar patterns of vulnerability introduction.</w:t>
       </w:r>
     </w:p>
     <w:p>
       <w:pPr>
         <w:spacing w:before="160" w:after="80"/>
-        <w:ind w:firstLine="0"/>
       </w:pPr>
       <w:r>
         <w:rPr>
@@ -463,7 +382,7 @@
           <w:i/>
           <w:sz w:val="20"/>
         </w:rPr>
-        <w:t>B. BaxBench and Code Security Benchmarking</w:t>
+        <w:t>B. BaxBench and Benchmarking Frameworks</w:t>
       </w:r>
     </w:p>
     <w:p>
@@ -479,7 +398,21 @@
           <w:i w:val="0"/>
           <w:sz w:val="20"/>
         </w:rPr>
-        <w:t>He et al. [4] introduced BaxBench as the first comprehensive benchmark specifically designed for evaluating the security of AI-generated web applications. BaxBench generates complete applications from OpenAPI specifications, containerizes them in Docker, and runs automated exploit tests. The framework tests 28 real-world scenarios across three web frameworks (Python-Flask, JavaScript-Express, Go-Fiber) and monitors 23 CWE types. Their evaluation of 12 models found that even the best-performing models achieved security pass rates below 15%.</w:t>
+        <w:t>He et al. [4] introduced BaxBench at ICML 2025 as the first end-to-end benchmark for AI-generated web application security. The key innovation was generating complete, runnable applications—not just code snippets—and testing them dynamically in Docker containers. BaxBench covered 28 scenarios and 23 CWEs across three frameworks. Our work builds directly on their framework, extending it with additional scenarios, vulnerability types, and the three-layer validation approach that is the central contribution of this paper.</w:t>
+      </w:r>
+    </w:p>
+    <w:p>
+      <w:pPr>
+        <w:spacing w:before="160" w:after="80"/>
+      </w:pPr>
+      <w:r>
+        <w:rPr>
+          <w:rFonts w:ascii="Times New Roman" w:hAnsi="Times New Roman"/>
+          <w:b w:val="0"/>
+          <w:i/>
+          <w:sz w:val="20"/>
+        </w:rPr>
+        <w:t>C. OWASP ZAP and Automated Scanning</w:t>
       </w:r>
     </w:p>
     <w:p>
@@ -495,13 +428,12 @@
           <w:i w:val="0"/>
           <w:sz w:val="20"/>
         </w:rPr>
-        <w:t>Our work extends BaxBench in several significant ways: we add 15 new CWE types (bringing the total to 38), introduce 7 new scenarios aligned with the OWASP Top 10 2025 [6], significantly expand attack vector diversity, add a SAST module for static code analysis, and implement the three-layer validation methodology described in Section III.</w:t>
+        <w:t>OWASP ZAP [7] is the most widely used open-source web vulnerability scanner. It works by proxying HTTP traffic and applying both passive analysis (inspecting headers, cookies) and active scanning (injecting attack payloads). However, automated scanners have well-documented limitations. Bau et al. [8] compared several scanners at IEEE S&amp;P 2010 and found wide variation in detection rates, with no single tool achieving comprehensive coverage. Doupe et al. [9] identified the "state-space problem": scanners struggle with applications that require specific action sequences to reach vulnerable code. These limitations become particularly acute with JSON API backends, as we demonstrate in Section IV.</w:t>
       </w:r>
     </w:p>
     <w:p>
       <w:pPr>
         <w:spacing w:before="160" w:after="80"/>
-        <w:ind w:firstLine="0"/>
       </w:pPr>
       <w:r>
         <w:rPr>
@@ -510,7 +442,7 @@
           <w:i/>
           <w:sz w:val="20"/>
         </w:rPr>
-        <w:t>C. OWASP ZAP and Dynamic Application Security Testing</w:t>
+        <w:t>D. Manual Penetration Testing</w:t>
       </w:r>
     </w:p>
     <w:p>
@@ -526,7 +458,21 @@
           <w:i w:val="0"/>
           <w:sz w:val="20"/>
         </w:rPr>
-        <w:t>OWASP ZAP (Zed Attack Proxy) is the most widely deployed open-source DAST tool, used by security teams worldwide for web application vulnerability assessment [7]. ZAP operates as a proxy between the tester and the target application, intercepting and modifying HTTP traffic to detect vulnerabilities. Its capabilities include passive scanning of HTTP responses, active scanning with attack payloads, and API scanning with OpenAPI specification import.</w:t>
+        <w:t>The OWASP Web Security Testing Guide v4.2 [10] defines 107 test cases across 12 categories for manual web application security testing. The Penetration Testing Execution Standard (PTES) [11] provides the engagement framework. Research consistently shows that manual testing finds vulnerabilities that automated tools miss—Doupe et al. [9] reported 2-5x higher detection rates for applications with complex business logic. This evidence shaped our decision to include manual testing as the ground-truth layer in our methodology.</w:t>
+      </w:r>
+    </w:p>
+    <w:p>
+      <w:pPr>
+        <w:spacing w:before="160" w:after="80"/>
+      </w:pPr>
+      <w:r>
+        <w:rPr>
+          <w:rFonts w:ascii="Times New Roman" w:hAnsi="Times New Roman"/>
+          <w:b w:val="0"/>
+          <w:i/>
+          <w:sz w:val="20"/>
+        </w:rPr>
+        <w:t>E. Static vs. Dynamic Analysis</w:t>
       </w:r>
     </w:p>
     <w:p>
@@ -542,100 +488,7 @@
           <w:i w:val="0"/>
           <w:sz w:val="20"/>
         </w:rPr>
-        <w:t>However, DAST tools have known limitations. Bau et al. [8] conducted a comparative study of web vulnerability scanners and found significant variation in detection rates, with no single scanner achieving comprehensive coverage. Doupé et al. [9] identified the "state-space" problem: scanners struggle with stateful applications that require specific sequences of actions to reach vulnerable code paths.</w:t>
-      </w:r>
-    </w:p>
-    <w:p>
-      <w:pPr>
-        <w:spacing w:before="160" w:after="80"/>
-        <w:ind w:firstLine="0"/>
-      </w:pPr>
-      <w:r>
-        <w:rPr>
-          <w:rFonts w:ascii="Times New Roman" w:hAnsi="Times New Roman"/>
-          <w:b w:val="0"/>
-          <w:i/>
-          <w:sz w:val="20"/>
-        </w:rPr>
-        <w:t>D. Manual Penetration Testing Methodologies</w:t>
-      </w:r>
-    </w:p>
-    <w:p>
-      <w:pPr>
-        <w:spacing w:before="0" w:after="40"/>
-        <w:ind w:firstLine="283"/>
-        <w:jc w:val="both"/>
-      </w:pPr>
-      <w:r>
-        <w:rPr>
-          <w:rFonts w:ascii="Times New Roman" w:hAnsi="Times New Roman"/>
-          <w:b w:val="0"/>
-          <w:i w:val="0"/>
-          <w:sz w:val="20"/>
-        </w:rPr>
-        <w:t>The OWASP Web Security Testing Guide (WSTG) v4.2 [10] provides a comprehensive methodology for manual web application security testing, comprising 107 test cases organized into 12 categories. The Penetration Testing Execution Standard (PTES) [11] complements WSTG with a structured engagement framework. Research consistently demonstrates that manual penetration testing discovers vulnerabilities that automated tools miss. Doupé et al. [9] found that manual testing identified 2-5 times more vulnerabilities than automated scanners in web applications with complex business logic.</w:t>
-      </w:r>
-    </w:p>
-    <w:p>
-      <w:pPr>
-        <w:spacing w:before="160" w:after="80"/>
-        <w:ind w:firstLine="0"/>
-      </w:pPr>
-      <w:r>
-        <w:rPr>
-          <w:rFonts w:ascii="Times New Roman" w:hAnsi="Times New Roman"/>
-          <w:b w:val="0"/>
-          <w:i/>
-          <w:sz w:val="20"/>
-        </w:rPr>
-        <w:t>E. Safety Prompts and Secure Code Generation</w:t>
-      </w:r>
-    </w:p>
-    <w:p>
-      <w:pPr>
-        <w:spacing w:before="0" w:after="40"/>
-        <w:ind w:firstLine="283"/>
-        <w:jc w:val="both"/>
-      </w:pPr>
-      <w:r>
-        <w:rPr>
-          <w:rFonts w:ascii="Times New Roman" w:hAnsi="Times New Roman"/>
-          <w:b w:val="0"/>
-          <w:i w:val="0"/>
-          <w:sz w:val="20"/>
-        </w:rPr>
-        <w:t>The impact of prompt engineering on code security has received limited attention. Tony et al. [13] explored whether explicitly instructing LLMs to write secure code improves outcomes, finding that security-focused prompts reduced vulnerability rates by 10-25% depending on the model and vulnerability type. Khoury et al. [18] evaluated ChatGPT-generated code security and found similar patterns of vulnerability introduction. Our work extends this analysis across 20 model configurations and three distinct safety prompt levels, providing the most comprehensive evaluation of safety prompt effectiveness to date.</w:t>
-      </w:r>
-    </w:p>
-    <w:p>
-      <w:pPr>
-        <w:spacing w:before="160" w:after="80"/>
-        <w:ind w:firstLine="0"/>
-      </w:pPr>
-      <w:r>
-        <w:rPr>
-          <w:rFonts w:ascii="Times New Roman" w:hAnsi="Times New Roman"/>
-          <w:b w:val="0"/>
-          <w:i/>
-          <w:sz w:val="20"/>
-        </w:rPr>
-        <w:t>F. Static vs. Dynamic Analysis</w:t>
-      </w:r>
-    </w:p>
-    <w:p>
-      <w:pPr>
-        <w:spacing w:before="0" w:after="40"/>
-        <w:ind w:firstLine="283"/>
-        <w:jc w:val="both"/>
-      </w:pPr>
-      <w:r>
-        <w:rPr>
-          <w:rFonts w:ascii="Times New Roman" w:hAnsi="Times New Roman"/>
-          <w:b w:val="0"/>
-          <w:i w:val="0"/>
-          <w:sz w:val="20"/>
-        </w:rPr>
-        <w:t>Static application security testing (SAST) and dynamic application security testing (DAST) offer complementary perspectives on code security. Antunes and Vieira [14] compared penetration testing and static analysis for SQL injection detection in web services, finding that each method detected vulnerabilities missed by the other. Nunes et al. [15] benchmarked static analysis tools for web security and demonstrated that combining both approaches yields significantly higher detection rates than either method alone, supporting our multi-layer methodology.</w:t>
+        <w:t>The SAST-versus-DAST question is well studied. Antunes and Vieira [14] compared the two approaches for SQL injection detection and found that each caught issues the other missed. Nunes et al. [15] benchmarked static analysis tools and reached a similar conclusion: combining approaches beats either one alone. NIST's Secure Software Development Framework [17] and AI Risk Management Framework [16] both recommend layered testing approaches, which informed our three-layer design.</w:t>
       </w:r>
     </w:p>
     <w:p>
@@ -657,7 +510,6 @@
     <w:p>
       <w:pPr>
         <w:spacing w:before="160" w:after="80"/>
-        <w:ind w:firstLine="0"/>
       </w:pPr>
       <w:r>
         <w:rPr>
@@ -666,7 +518,7 @@
           <w:i/>
           <w:sz w:val="20"/>
         </w:rPr>
-        <w:t>A. Architecture Overview</w:t>
+        <w:t>A. Testing Pipeline</w:t>
       </w:r>
     </w:p>
     <w:p>
@@ -682,13 +534,12 @@
           <w:i w:val="0"/>
           <w:sz w:val="20"/>
         </w:rPr>
-        <w:t>CodeStrike follows a five-stage pipeline for each test case: (1) Prompt Construction: an OpenAPI specification describing the target application's endpoints, combined with an optional safety prompt, is sent to the target LLM. (2) Code Generation: the LLM generates a complete web application implementation at temperature 0.2 for reproducibility. (3) Containerization: generated code is packaged with framework dependencies into a Docker container with a 1GB memory limit and 60-second health check timeout. (4) Functional Testing: tests verify that the application correctly implements the specified API behavior. (5) Security Testing: three layers of security testing are applied to applications that pass functional tests.</w:t>
+        <w:t>CodeStrike follows a five-stage pipeline. First, we construct a prompt containing an OpenAPI specification and an optional safety instruction, and send it to the target LLM at temperature 0.2. Second, the model generates a complete web application. Third, we package the code into a Docker container with framework dependencies and a 1GB memory limit. Fourth, we run functional tests to verify the application works correctly (can register users, process requests, return proper responses). Fifth, we apply three layers of security testing to every application that passes the functional tests.</w:t>
       </w:r>
     </w:p>
     <w:p>
       <w:pPr>
         <w:spacing w:before="160" w:after="80"/>
-        <w:ind w:firstLine="0"/>
       </w:pPr>
       <w:r>
         <w:rPr>
@@ -697,7 +548,7 @@
           <w:i/>
           <w:sz w:val="20"/>
         </w:rPr>
-        <w:t>B. Security Testing Layers</w:t>
+        <w:t>B. Layer 1: Automated Exploit Testing</w:t>
       </w:r>
     </w:p>
     <w:p>
@@ -713,7 +564,21 @@
           <w:i w:val="0"/>
           <w:sz w:val="20"/>
         </w:rPr>
-        <w:t>Layer 1: CodeStrike Automated Testing. The automated layer comprises three testing categories. Dynamic exploit tests send real HTTP attack payloads to the running application, including 25 XSS vectors, 25 SQL injection vectors, 12 OS command injection payloads, 22 path traversal variants, and 10 SSRF vectors. Universal security checks test for security headers (X-Content-Type-Options, X-Frame-Options, Content-Security-Policy), session cookie flags, CORS configuration, error information leakage, and rate limiting. Static analysis (SAST) performs regex-based source code scanning for dangerous patterns including eval(), exec(), weak cryptographic functions, weak PRNGs, and unsafe deserialization.</w:t>
+        <w:t>The automated layer has three components. Dynamic exploit tests send real attack payloads to the running application: 25 XSS vectors (including polyglot, SVG, and URL-encoded variants), 25 SQL injection payloads (UNION, blind, time-based, stacked), 12 OS command injection attempts, 22 path traversal variants, and 10 SSRF vectors. Universal security checks examine HTTP headers, cookie flags, CORS policy, error handling, and rate limiting (we send 150 rapid requests to authentication endpoints). A static analysis module scans source code for dangerous patterns like eval(), weak cryptographic functions, and unsafe deserialization.</w:t>
+      </w:r>
+    </w:p>
+    <w:p>
+      <w:pPr>
+        <w:spacing w:before="160" w:after="80"/>
+      </w:pPr>
+      <w:r>
+        <w:rPr>
+          <w:rFonts w:ascii="Times New Roman" w:hAnsi="Times New Roman"/>
+          <w:b w:val="0"/>
+          <w:i/>
+          <w:sz w:val="20"/>
+        </w:rPr>
+        <w:t>C. Layer 2: OWASP ZAP Scanning</w:t>
       </w:r>
     </w:p>
     <w:p>
@@ -729,7 +594,21 @@
           <w:i w:val="0"/>
           <w:sz w:val="20"/>
         </w:rPr>
-        <w:t>Layer 2: OWASP ZAP Scanning. We scanned 50 applications using OWASP ZAP in three modes: baseline scan (passive analysis of HTTP headers), full scan (active scanning with all 56 attack rules), and API scan (active scanning with OpenAPI specification imported).</w:t>
+        <w:t>We ran OWASP ZAP against 50 applications in three modes: baseline (passive header checks), full scan (all 56 active rules), and API scan with the application's OpenAPI specification imported. The API scan mode was intended to give ZAP its best chance by providing the complete endpoint map.</w:t>
+      </w:r>
+    </w:p>
+    <w:p>
+      <w:pPr>
+        <w:spacing w:before="160" w:after="80"/>
+      </w:pPr>
+      <w:r>
+        <w:rPr>
+          <w:rFonts w:ascii="Times New Roman" w:hAnsi="Times New Roman"/>
+          <w:b w:val="0"/>
+          <w:i/>
+          <w:sz w:val="20"/>
+        </w:rPr>
+        <w:t>D. Layer 3: Manual Penetration Testing</w:t>
       </w:r>
     </w:p>
     <w:p>
@@ -745,7 +624,7 @@
           <w:i w:val="0"/>
           <w:sz w:val="20"/>
         </w:rPr>
-        <w:t>Layer 3: Manual Penetration Testing. Two testers conducted manual security assessments of 10 applications over three days (April 4-6, 2026), following the OWASP WSTG v4.2 methodology [10]. Each session lasted approximately 30 minutes and followed a structured process: application launch and reconnaissance (5 min), OWASP ZAP automated scan (5 min), source code review (5 min), manual exploit testing against a 24-item OWASP WSTG checklist (15 min), and evidence collection and classification (5 min).</w:t>
+        <w:t>Two testers manually assessed 10 applications over three days (April 4–6, 2026), following OWASP WSTG v4.2 [10]. Each session took about 30 minutes: 5 minutes for setup and reconnaissance, 5 minutes for a ZAP scan, 5 minutes reviewing the source code, 15 minutes of manual testing against a 24-item checklist, and 5 minutes collecting evidence. The checklist covered universal checks (HTTP method tampering, race conditions), authentication checks (JWT manipulation, privilege escalation), business logic checks (negative quantities, workflow bypass), file handling, and external input validation (SSRF, XXE).</w:t>
       </w:r>
     </w:p>
     <w:p>
@@ -761,13 +640,12 @@
           <w:i w:val="0"/>
           <w:sz w:val="20"/>
         </w:rPr>
-        <w:t>The 24-item checklist covered five categories: universal checks (6 items), authentication checks (6 items), business logic checks (5 items), file handling checks (4 items), and external input checks (3 items). Applications were selected to maximize coverage across 6 model configurations, 3 frameworks, and 10 distinct scenarios.</w:t>
+        <w:t>We selected applications to maximize diversity: 6 different model configurations, all 3 frameworks, and 10 distinct scenarios including 7 of our new OWASP 2025-aligned ones. All applications used the "none" safety prompt level to maximize the vulnerability surface.</w:t>
       </w:r>
     </w:p>
     <w:p>
       <w:pPr>
         <w:spacing w:before="160" w:after="80"/>
-        <w:ind w:firstLine="0"/>
       </w:pPr>
       <w:r>
         <w:rPr>
@@ -776,7 +654,37 @@
           <w:i/>
           <w:sz w:val="20"/>
         </w:rPr>
-        <w:t>C. Metrics</w:t>
+        <w:t>E. Metrics</w:t>
+      </w:r>
+    </w:p>
+    <w:p>
+      <w:pPr>
+        <w:spacing w:before="0" w:after="40"/>
+        <w:ind w:firstLine="0"/>
+        <w:jc w:val="both"/>
+      </w:pPr>
+      <w:r>
+        <w:rPr>
+          <w:rFonts w:ascii="Times New Roman" w:hAnsi="Times New Roman"/>
+          <w:b w:val="0"/>
+          <w:i w:val="0"/>
+          <w:sz w:val="20"/>
+        </w:rPr>
+        <w:t>We report three metrics. pass@1 is the fraction of applications that pass functional tests. sec_pass@1 is the fraction that both work correctly and have zero detected vulnerabilities. true_sec@1 is stricter: it excludes "secure by crash" applications—those that pass security tests only because they crash before reaching vulnerable code paths. The gap between sec_pass@1 and true_sec@1 reveals how much the naive metric is inflated by broken code.</w:t>
+      </w:r>
+    </w:p>
+    <w:p>
+      <w:pPr>
+        <w:spacing w:before="160" w:after="80"/>
+      </w:pPr>
+      <w:r>
+        <w:rPr>
+          <w:rFonts w:ascii="Times New Roman" w:hAnsi="Times New Roman"/>
+          <w:b w:val="0"/>
+          <w:i/>
+          <w:sz w:val="20"/>
+        </w:rPr>
+        <w:t>F. Models and Configurations</w:t>
       </w:r>
     </w:p>
     <w:p>
@@ -792,54 +700,7 @@
           <w:i w:val="0"/>
           <w:sz w:val="20"/>
         </w:rPr>
-        <w:t>We define three metrics for evaluating AI-generated code security. pass@1 measures the proportion of generated applications that pass all functional tests (functional_passes / total_results). sec_pass@1 measures the proportion that are both functional and free of detected vulnerabilities. true_sec@1 is a stricter metric excluding "secure by crash" applications that pass security tests only because they crash before vulnerable code paths are reached.</w:t>
-      </w:r>
-    </w:p>
-    <w:p>
-      <w:pPr>
-        <w:spacing w:before="160" w:after="80"/>
-        <w:ind w:firstLine="0"/>
-      </w:pPr>
-      <w:r>
-        <w:rPr>
-          <w:rFonts w:ascii="Times New Roman" w:hAnsi="Times New Roman"/>
-          <w:b w:val="0"/>
-          <w:i/>
-          <w:sz w:val="20"/>
-        </w:rPr>
-        <w:t>D. Experimental Setup</w:t>
-      </w:r>
-    </w:p>
-    <w:p>
-      <w:pPr>
-        <w:spacing w:before="0" w:after="40"/>
-        <w:ind w:firstLine="283"/>
-        <w:jc w:val="both"/>
-      </w:pPr>
-      <w:r>
-        <w:rPr>
-          <w:rFonts w:ascii="Times New Roman" w:hAnsi="Times New Roman"/>
-          <w:b w:val="0"/>
-          <w:i w:val="0"/>
-          <w:sz w:val="20"/>
-        </w:rPr>
-        <w:t>We evaluated 20 model configurations: Claude Opus 4, 4.1, and 4.6 (standard and thinking variants), Claude Sonnet 4, 4.5, and 4.6 (standard and thinking), Claude Haiku 4.5, DeepSeek Coder 6.7B (via Ollama), and Meta LLaMA 3.3 70B (via OpenRouter). Each configuration was tested across 28 scenarios, 3 frameworks, and 3 safety prompt levels with one sample per combination.</w:t>
-      </w:r>
-    </w:p>
-    <w:p>
-      <w:pPr>
-        <w:spacing w:before="0" w:after="40"/>
-        <w:ind w:firstLine="283"/>
-        <w:jc w:val="both"/>
-      </w:pPr>
-      <w:r>
-        <w:rPr>
-          <w:rFonts w:ascii="Times New Roman" w:hAnsi="Times New Roman"/>
-          <w:b w:val="0"/>
-          <w:i w:val="0"/>
-          <w:sz w:val="20"/>
-        </w:rPr>
-        <w:t>Safety prompt levels were: None (no security instructions), Generic ("follow security best practices"), and Specific (detailed vulnerability-aware instructions listing specific mitigations such as parameterized queries, input sanitization, CSRF tokens, and framework-specific security libraries).</w:t>
+        <w:t>We tested 20 configurations: Claude Opus 4, 4.1, and 4.6 (standard and thinking), Claude Sonnet 4, 4.5, and 4.6 (standard and thinking), Claude Haiku 4.5, DeepSeek Coder 6.7B via Ollama, and Meta LLaMA 3.3 70B via OpenRouter. Each was tested across 28 scenarios, 3 frameworks, and 3 safety prompt levels (none, generic, specific).</w:t>
       </w:r>
     </w:p>
     <w:p>
@@ -861,7 +722,6 @@
     <w:p>
       <w:pPr>
         <w:spacing w:before="160" w:after="80"/>
-        <w:ind w:firstLine="0"/>
       </w:pPr>
       <w:r>
         <w:rPr>
@@ -870,7 +730,78 @@
           <w:i/>
           <w:sz w:val="20"/>
         </w:rPr>
-        <w:t>A. Overall Security Assessment</w:t>
+        <w:t>A. The Security Funnel</w:t>
+      </w:r>
+    </w:p>
+    <w:p>
+      <w:pPr>
+        <w:spacing w:before="0" w:after="40"/>
+        <w:ind w:firstLine="0"/>
+        <w:jc w:val="both"/>
+      </w:pPr>
+      <w:r>
+        <w:rPr>
+          <w:rFonts w:ascii="Times New Roman" w:hAnsi="Times New Roman"/>
+          <w:b w:val="0"/>
+          <w:i w:val="0"/>
+          <w:sz w:val="20"/>
+        </w:rPr>
+        <w:t>Of 3,686 generated applications, only 1,679 (45.6%) passed functional tests—meaning more than half of AI-generated code does not work at all. Of those that did work, only 248 (14.8% of functional apps, 6.7% of all) had zero detected vulnerabilities. The true secure rate, after removing "secure by crash" apps, was 6.3%. Fig. 1 illustrates this funnel.</w:t>
+      </w:r>
+    </w:p>
+    <w:p>
+      <w:pPr>
+        <w:spacing w:before="120" w:after="40"/>
+        <w:jc w:val="center"/>
+      </w:pPr>
+      <w:r>
+        <w:drawing>
+          <wp:inline xmlns:a="http://schemas.openxmlformats.org/drawingml/2006/main" xmlns:pic="http://schemas.openxmlformats.org/drawingml/2006/picture">
+            <wp:extent cx="3017520" cy="1907216"/>
+            <wp:docPr id="1" name="Picture 1"/>
+            <wp:cNvGraphicFramePr>
+              <a:graphicFrameLocks noChangeAspect="1"/>
+            </wp:cNvGraphicFramePr>
+            <a:graphic>
+              <a:graphicData uri="http://schemas.openxmlformats.org/drawingml/2006/picture">
+                <pic:pic>
+                  <pic:nvPicPr>
+                    <pic:cNvPr id="0" name="fig1_security_funnel.png"/>
+                    <pic:cNvPicPr/>
+                  </pic:nvPicPr>
+                  <pic:blipFill>
+                    <a:blip r:embed="rId9"/>
+                    <a:stretch>
+                      <a:fillRect/>
+                    </a:stretch>
+                  </pic:blipFill>
+                  <pic:spPr>
+                    <a:xfrm>
+                      <a:off x="0" y="0"/>
+                      <a:ext cx="3017520" cy="1907216"/>
+                    </a:xfrm>
+                    <a:prstGeom prst="rect"/>
+                  </pic:spPr>
+                </pic:pic>
+              </a:graphicData>
+            </a:graphic>
+          </wp:inline>
+        </w:drawing>
+      </w:r>
+    </w:p>
+    <w:p>
+      <w:pPr>
+        <w:spacing w:before="40" w:after="120"/>
+        <w:jc w:val="center"/>
+      </w:pPr>
+      <w:r>
+        <w:rPr>
+          <w:rFonts w:ascii="Times New Roman" w:hAnsi="Times New Roman"/>
+          <w:b w:val="0"/>
+          <w:i w:val="0"/>
+          <w:sz w:val="16"/>
+        </w:rPr>
+        <w:t>Fig. 1. The AI code security funnel. Of 3,686 generated applications, only 248 (6.7%) are both functional and free of detected vulnerabilities.</w:t>
       </w:r>
     </w:p>
     <w:p>
@@ -1194,58 +1125,30 @@
           </w:p>
         </w:tc>
       </w:tr>
-      <w:tr>
-        <w:tc>
-          <w:tcPr>
-            <w:tcW w:type="dxa" w:w="5063"/>
-          </w:tcPr>
-          <w:p>
-            <w:pPr>
-              <w:jc w:val="center"/>
-            </w:pPr>
-            <w:r/>
-            <w:r>
-              <w:rPr>
-                <w:rFonts w:ascii="Times New Roman" w:hAnsi="Times New Roman"/>
-                <w:b w:val="0"/>
-                <w:i w:val="0"/>
-                <w:sz w:val="16"/>
-              </w:rPr>
-              <w:t>Unique CWE types detected</w:t>
-            </w:r>
-          </w:p>
-        </w:tc>
-        <w:tc>
-          <w:tcPr>
-            <w:tcW w:type="dxa" w:w="5063"/>
-          </w:tcPr>
-          <w:p>
-            <w:pPr>
-              <w:jc w:val="center"/>
-            </w:pPr>
-            <w:r/>
-            <w:r>
-              <w:rPr>
-                <w:rFonts w:ascii="Times New Roman" w:hAnsi="Times New Roman"/>
-                <w:b w:val="0"/>
-                <w:i w:val="0"/>
-                <w:sz w:val="16"/>
-              </w:rPr>
-              <w:t>14</w:t>
-            </w:r>
-          </w:p>
-        </w:tc>
-      </w:tr>
     </w:tbl>
     <w:p>
       <w:pPr>
-        <w:spacing w:before="80" w:after="40"/>
+        <w:spacing w:before="80"/>
       </w:pPr>
     </w:p>
     <w:p>
       <w:pPr>
+        <w:spacing w:before="160" w:after="80"/>
+      </w:pPr>
+      <w:r>
+        <w:rPr>
+          <w:rFonts w:ascii="Times New Roman" w:hAnsi="Times New Roman"/>
+          <w:b w:val="0"/>
+          <w:i/>
+          <w:sz w:val="20"/>
+        </w:rPr>
+        <w:t>B. Model Comparison</w:t>
+      </w:r>
+    </w:p>
+    <w:p>
+      <w:pPr>
         <w:spacing w:before="0" w:after="40"/>
-        <w:ind w:firstLine="283"/>
+        <w:ind w:firstLine="0"/>
         <w:jc w:val="both"/>
       </w:pPr>
       <w:r>
@@ -1255,22 +1158,62 @@
           <w:i w:val="0"/>
           <w:sz w:val="20"/>
         </w:rPr>
-        <w:t>Of 3,686 generated applications, only 1,679 (45.6%) passed functional tests, indicating that more than half of AI-generated code does not even work correctly. Of the functional applications, only 248 (14.8% of functional, 6.7% of total) were free of detected vulnerabilities. The true secure rate, excluding applications that passed security tests due to crashes, was 6.3%.</w:t>
+        <w:t>Fig. 2 shows how models compare on functional and security pass rates. The best model overall was opus-4.1-thinking at 14.3% sec_pass@1 and 73.0% pass@1. Thinking-mode models generally performed better, with an average +2.1 percentage point improvement in sec_pass@1, though the effect was not consistent—sonnet-4.5-thinking actually scored lower than its standard counterpart. DeepSeek Coder 6.7B, the only free open-source model we tested, managed a 14.3% functional pass rate but 0% sec_pass@1.</w:t>
       </w:r>
     </w:p>
     <w:p>
       <w:pPr>
-        <w:spacing w:before="160" w:after="80"/>
-        <w:ind w:firstLine="0"/>
+        <w:spacing w:before="120" w:after="40"/>
+        <w:jc w:val="center"/>
+      </w:pPr>
+      <w:r>
+        <w:drawing>
+          <wp:inline xmlns:a="http://schemas.openxmlformats.org/drawingml/2006/main" xmlns:pic="http://schemas.openxmlformats.org/drawingml/2006/picture">
+            <wp:extent cx="3017520" cy="2203867"/>
+            <wp:docPr id="2" name="Picture 2"/>
+            <wp:cNvGraphicFramePr>
+              <a:graphicFrameLocks noChangeAspect="1"/>
+            </wp:cNvGraphicFramePr>
+            <a:graphic>
+              <a:graphicData uri="http://schemas.openxmlformats.org/drawingml/2006/picture">
+                <pic:pic>
+                  <pic:nvPicPr>
+                    <pic:cNvPr id="0" name="fig2_model_comparison.png"/>
+                    <pic:cNvPicPr/>
+                  </pic:nvPicPr>
+                  <pic:blipFill>
+                    <a:blip r:embed="rId10"/>
+                    <a:stretch>
+                      <a:fillRect/>
+                    </a:stretch>
+                  </pic:blipFill>
+                  <pic:spPr>
+                    <a:xfrm>
+                      <a:off x="0" y="0"/>
+                      <a:ext cx="3017520" cy="2203867"/>
+                    </a:xfrm>
+                    <a:prstGeom prst="rect"/>
+                  </pic:spPr>
+                </pic:pic>
+              </a:graphicData>
+            </a:graphic>
+          </wp:inline>
+        </w:drawing>
+      </w:r>
+    </w:p>
+    <w:p>
+      <w:pPr>
+        <w:spacing w:before="40" w:after="120"/>
+        <w:jc w:val="center"/>
       </w:pPr>
       <w:r>
         <w:rPr>
           <w:rFonts w:ascii="Times New Roman" w:hAnsi="Times New Roman"/>
           <w:b w:val="0"/>
-          <w:i/>
-          <w:sz w:val="20"/>
+          <w:i w:val="0"/>
+          <w:sz w:val="16"/>
         </w:rPr>
-        <w:t>B. Model Comparison</w:t>
+        <w:t>Fig. 2. Model comparison: functional pass rate (pass@1) vs. secure pass rate (sec_pass@1) for top 10 configurations.</w:t>
       </w:r>
     </w:p>
     <w:p>
@@ -1318,7 +1261,7 @@
                 <w:i w:val="0"/>
                 <w:sz w:val="16"/>
               </w:rPr>
-              <w:t>Model Configuration</w:t>
+              <w:t>Model</w:t>
             </w:r>
           </w:p>
         </w:tc>
@@ -1676,13 +1619,27 @@
     </w:tbl>
     <w:p>
       <w:pPr>
-        <w:spacing w:before="80" w:after="40"/>
+        <w:spacing w:before="80"/>
       </w:pPr>
     </w:p>
     <w:p>
       <w:pPr>
+        <w:spacing w:before="160" w:after="80"/>
+      </w:pPr>
+      <w:r>
+        <w:rPr>
+          <w:rFonts w:ascii="Times New Roman" w:hAnsi="Times New Roman"/>
+          <w:b w:val="0"/>
+          <w:i/>
+          <w:sz w:val="20"/>
+        </w:rPr>
+        <w:t>C. Safety Prompts: The Biggest Finding</w:t>
+      </w:r>
+    </w:p>
+    <w:p>
+      <w:pPr>
         <w:spacing w:before="0" w:after="40"/>
-        <w:ind w:firstLine="283"/>
+        <w:ind w:firstLine="0"/>
         <w:jc w:val="both"/>
       </w:pPr>
       <w:r>
@@ -1692,38 +1649,62 @@
           <w:i w:val="0"/>
           <w:sz w:val="20"/>
         </w:rPr>
-        <w:t>The opus-4.1-thinking configuration achieved the highest security pass rate at 14.3%, while also achieving the highest functional pass rate at 73.0%. Thinking-mode variants generally outperformed their standard counterparts, with an average improvement of 2.1 percentage points in sec_pass@1. However, the improvement is inconsistent: sonnet-4.5-thinking had a lower sec_pass@1 than sonnet-4.5-standard (-4.4pp), suggesting that thinking mode does not universally improve security.</w:t>
+        <w:t>This is the most important result in the paper. Without any safety instructions, the sec_pass@1 rate was 0.0% across all models. A generic prompt like "follow security best practices" barely moved the needle to 0.1%. But when we gave the model specific instructions—listing vulnerability types to avoid, naming mitigations like parameterized queries and CSRF tokens, and pointing to framework-specific libraries—sec_pass@1 jumped to 21.0%. Fig. 3 shows this contrast.</w:t>
       </w:r>
     </w:p>
     <w:p>
       <w:pPr>
-        <w:spacing w:before="0" w:after="40"/>
-        <w:ind w:firstLine="283"/>
-        <w:jc w:val="both"/>
+        <w:spacing w:before="120" w:after="40"/>
+        <w:jc w:val="center"/>
+      </w:pPr>
+      <w:r>
+        <w:drawing>
+          <wp:inline xmlns:a="http://schemas.openxmlformats.org/drawingml/2006/main" xmlns:pic="http://schemas.openxmlformats.org/drawingml/2006/picture">
+            <wp:extent cx="3017520" cy="1750645"/>
+            <wp:docPr id="3" name="Picture 3"/>
+            <wp:cNvGraphicFramePr>
+              <a:graphicFrameLocks noChangeAspect="1"/>
+            </wp:cNvGraphicFramePr>
+            <a:graphic>
+              <a:graphicData uri="http://schemas.openxmlformats.org/drawingml/2006/picture">
+                <pic:pic>
+                  <pic:nvPicPr>
+                    <pic:cNvPr id="0" name="fig3_safety_prompt.png"/>
+                    <pic:cNvPicPr/>
+                  </pic:nvPicPr>
+                  <pic:blipFill>
+                    <a:blip r:embed="rId11"/>
+                    <a:stretch>
+                      <a:fillRect/>
+                    </a:stretch>
+                  </pic:blipFill>
+                  <pic:spPr>
+                    <a:xfrm>
+                      <a:off x="0" y="0"/>
+                      <a:ext cx="3017520" cy="1750645"/>
+                    </a:xfrm>
+                    <a:prstGeom prst="rect"/>
+                  </pic:spPr>
+                </pic:pic>
+              </a:graphicData>
+            </a:graphic>
+          </wp:inline>
+        </w:drawing>
+      </w:r>
+    </w:p>
+    <w:p>
+      <w:pPr>
+        <w:spacing w:before="40" w:after="120"/>
+        <w:jc w:val="center"/>
       </w:pPr>
       <w:r>
         <w:rPr>
           <w:rFonts w:ascii="Times New Roman" w:hAnsi="Times New Roman"/>
           <w:b w:val="0"/>
           <w:i w:val="0"/>
-          <w:sz w:val="20"/>
+          <w:sz w:val="16"/>
         </w:rPr>
-        <w:t>The open-source model DeepSeek Coder 6.7B achieved a 14.3% functional pass rate but 0% sec_pass@1, indicating that while it can generate working code in some cases, it consistently fails to implement security measures.</w:t>
-      </w:r>
-    </w:p>
-    <w:p>
-      <w:pPr>
-        <w:spacing w:before="160" w:after="80"/>
-        <w:ind w:firstLine="0"/>
-      </w:pPr>
-      <w:r>
-        <w:rPr>
-          <w:rFonts w:ascii="Times New Roman" w:hAnsi="Times New Roman"/>
-          <w:b w:val="0"/>
-          <w:i/>
-          <w:sz w:val="20"/>
-        </w:rPr>
-        <w:t>C. Safety Prompt Impact</w:t>
+        <w:t>Fig. 3. Impact of safety prompt specificity on pass@1 and sec_pass@1. Specific prompts raise sec_pass@1 from 0.0% to 21.0%.</w:t>
       </w:r>
     </w:p>
     <w:p>
@@ -1750,16 +1731,15 @@
         <w:tblLook w:firstColumn="1" w:firstRow="1" w:lastColumn="0" w:lastRow="0" w:noHBand="0" w:noVBand="1" w:val="04A0"/>
       </w:tblPr>
       <w:tblGrid>
-        <w:gridCol w:w="2025"/>
-        <w:gridCol w:w="2025"/>
-        <w:gridCol w:w="2025"/>
-        <w:gridCol w:w="2025"/>
-        <w:gridCol w:w="2025"/>
+        <w:gridCol w:w="2531"/>
+        <w:gridCol w:w="2531"/>
+        <w:gridCol w:w="2531"/>
+        <w:gridCol w:w="2531"/>
       </w:tblGrid>
       <w:tr>
         <w:tc>
           <w:tcPr>
-            <w:tcW w:type="dxa" w:w="2025"/>
+            <w:tcW w:type="dxa" w:w="2531"/>
           </w:tcPr>
           <w:p>
             <w:pPr>
@@ -1779,7 +1759,7 @@
         </w:tc>
         <w:tc>
           <w:tcPr>
-            <w:tcW w:type="dxa" w:w="2025"/>
+            <w:tcW w:type="dxa" w:w="2531"/>
           </w:tcPr>
           <w:p>
             <w:pPr>
@@ -1799,7 +1779,7 @@
         </w:tc>
         <w:tc>
           <w:tcPr>
-            <w:tcW w:type="dxa" w:w="2025"/>
+            <w:tcW w:type="dxa" w:w="2531"/>
           </w:tcPr>
           <w:p>
             <w:pPr>
@@ -1819,7 +1799,7 @@
         </w:tc>
         <w:tc>
           <w:tcPr>
-            <w:tcW w:type="dxa" w:w="2025"/>
+            <w:tcW w:type="dxa" w:w="2531"/>
           </w:tcPr>
           <w:p>
             <w:pPr>
@@ -1837,31 +1817,11 @@
             </w:r>
           </w:p>
         </w:tc>
-        <w:tc>
-          <w:tcPr>
-            <w:tcW w:type="dxa" w:w="2025"/>
-          </w:tcPr>
-          <w:p>
-            <w:pPr>
-              <w:jc w:val="center"/>
-            </w:pPr>
-            <w:r/>
-            <w:r>
-              <w:rPr>
-                <w:rFonts w:ascii="Times New Roman" w:hAnsi="Times New Roman"/>
-                <w:b/>
-                <w:i w:val="0"/>
-                <w:sz w:val="16"/>
-              </w:rPr>
-              <w:t>true_sec@1</w:t>
-            </w:r>
-          </w:p>
-        </w:tc>
       </w:tr>
       <w:tr>
         <w:tc>
           <w:tcPr>
-            <w:tcW w:type="dxa" w:w="2025"/>
+            <w:tcW w:type="dxa" w:w="2531"/>
           </w:tcPr>
           <w:p>
             <w:pPr>
@@ -1881,7 +1841,7 @@
         </w:tc>
         <w:tc>
           <w:tcPr>
-            <w:tcW w:type="dxa" w:w="2025"/>
+            <w:tcW w:type="dxa" w:w="2531"/>
           </w:tcPr>
           <w:p>
             <w:pPr>
@@ -1901,7 +1861,7 @@
         </w:tc>
         <w:tc>
           <w:tcPr>
-            <w:tcW w:type="dxa" w:w="2025"/>
+            <w:tcW w:type="dxa" w:w="2531"/>
           </w:tcPr>
           <w:p>
             <w:pPr>
@@ -1921,27 +1881,7 @@
         </w:tc>
         <w:tc>
           <w:tcPr>
-            <w:tcW w:type="dxa" w:w="2025"/>
-          </w:tcPr>
-          <w:p>
-            <w:pPr>
-              <w:jc w:val="center"/>
-            </w:pPr>
-            <w:r/>
-            <w:r>
-              <w:rPr>
-                <w:rFonts w:ascii="Times New Roman" w:hAnsi="Times New Roman"/>
-                <w:b w:val="0"/>
-                <w:i w:val="0"/>
-                <w:sz w:val="16"/>
-              </w:rPr>
-              <w:t>0.0%</w:t>
-            </w:r>
-          </w:p>
-        </w:tc>
-        <w:tc>
-          <w:tcPr>
-            <w:tcW w:type="dxa" w:w="2025"/>
+            <w:tcW w:type="dxa" w:w="2531"/>
           </w:tcPr>
           <w:p>
             <w:pPr>
@@ -1963,7 +1903,7 @@
       <w:tr>
         <w:tc>
           <w:tcPr>
-            <w:tcW w:type="dxa" w:w="2025"/>
+            <w:tcW w:type="dxa" w:w="2531"/>
           </w:tcPr>
           <w:p>
             <w:pPr>
@@ -1983,7 +1923,7 @@
         </w:tc>
         <w:tc>
           <w:tcPr>
-            <w:tcW w:type="dxa" w:w="2025"/>
+            <w:tcW w:type="dxa" w:w="2531"/>
           </w:tcPr>
           <w:p>
             <w:pPr>
@@ -2003,7 +1943,7 @@
         </w:tc>
         <w:tc>
           <w:tcPr>
-            <w:tcW w:type="dxa" w:w="2025"/>
+            <w:tcW w:type="dxa" w:w="2531"/>
           </w:tcPr>
           <w:p>
             <w:pPr>
@@ -2023,7 +1963,7 @@
         </w:tc>
         <w:tc>
           <w:tcPr>
-            <w:tcW w:type="dxa" w:w="2025"/>
+            <w:tcW w:type="dxa" w:w="2531"/>
           </w:tcPr>
           <w:p>
             <w:pPr>
@@ -2041,31 +1981,11 @@
             </w:r>
           </w:p>
         </w:tc>
-        <w:tc>
-          <w:tcPr>
-            <w:tcW w:type="dxa" w:w="2025"/>
-          </w:tcPr>
-          <w:p>
-            <w:pPr>
-              <w:jc w:val="center"/>
-            </w:pPr>
-            <w:r/>
-            <w:r>
-              <w:rPr>
-                <w:rFonts w:ascii="Times New Roman" w:hAnsi="Times New Roman"/>
-                <w:b w:val="0"/>
-                <w:i w:val="0"/>
-                <w:sz w:val="16"/>
-              </w:rPr>
-              <w:t>0.0%</w:t>
-            </w:r>
-          </w:p>
-        </w:tc>
       </w:tr>
       <w:tr>
         <w:tc>
           <w:tcPr>
-            <w:tcW w:type="dxa" w:w="2025"/>
+            <w:tcW w:type="dxa" w:w="2531"/>
           </w:tcPr>
           <w:p>
             <w:pPr>
@@ -2085,7 +2005,7 @@
         </w:tc>
         <w:tc>
           <w:tcPr>
-            <w:tcW w:type="dxa" w:w="2025"/>
+            <w:tcW w:type="dxa" w:w="2531"/>
           </w:tcPr>
           <w:p>
             <w:pPr>
@@ -2105,7 +2025,7 @@
         </w:tc>
         <w:tc>
           <w:tcPr>
-            <w:tcW w:type="dxa" w:w="2025"/>
+            <w:tcW w:type="dxa" w:w="2531"/>
           </w:tcPr>
           <w:p>
             <w:pPr>
@@ -2125,7 +2045,7 @@
         </w:tc>
         <w:tc>
           <w:tcPr>
-            <w:tcW w:type="dxa" w:w="2025"/>
+            <w:tcW w:type="dxa" w:w="2531"/>
           </w:tcPr>
           <w:p>
             <w:pPr>
@@ -2143,31 +2063,11 @@
             </w:r>
           </w:p>
         </w:tc>
-        <w:tc>
-          <w:tcPr>
-            <w:tcW w:type="dxa" w:w="2025"/>
-          </w:tcPr>
-          <w:p>
-            <w:pPr>
-              <w:jc w:val="center"/>
-            </w:pPr>
-            <w:r/>
-            <w:r>
-              <w:rPr>
-                <w:rFonts w:ascii="Times New Roman" w:hAnsi="Times New Roman"/>
-                <w:b w:val="0"/>
-                <w:i w:val="0"/>
-                <w:sz w:val="16"/>
-              </w:rPr>
-              <w:t>19.8%</w:t>
-            </w:r>
-          </w:p>
-        </w:tc>
       </w:tr>
     </w:tbl>
     <w:p>
       <w:pPr>
-        <w:spacing w:before="80" w:after="40"/>
+        <w:spacing w:before="80"/>
       </w:pPr>
     </w:p>
     <w:p>
@@ -2183,7 +2083,21 @@
           <w:i w:val="0"/>
           <w:sz w:val="20"/>
         </w:rPr>
-        <w:t>The safety prompt analysis reveals the single most significant finding of this study. Without safety prompts, the sec_pass@1 rate is effectively 0.0% across all models. Generic safety prompts ("follow security best practices") provide negligible improvement at 0.1%. However, specific safety prompts with detailed vulnerability-aware instructions raise sec_pass@1 to 21.0% — an improvement of approximately 21 percentage points.</w:t>
+        <w:t>There is a trade-off: specific prompts reduced the functional pass rate from 53.6% to 33.2%. The models generate more complex code when asked to be secure, and that complexity introduces functional failures. But when the code does work, it is dramatically more likely to be secure. For anyone deploying AI-generated code in production, this finding has an immediate, practical takeaway: always use detailed safety prompts.</w:t>
+      </w:r>
+    </w:p>
+    <w:p>
+      <w:pPr>
+        <w:spacing w:before="160" w:after="80"/>
+      </w:pPr>
+      <w:r>
+        <w:rPr>
+          <w:rFonts w:ascii="Times New Roman" w:hAnsi="Times New Roman"/>
+          <w:b w:val="0"/>
+          <w:i/>
+          <w:sz w:val="20"/>
+        </w:rPr>
+        <w:t>D. Vulnerability Patterns</w:t>
       </w:r>
     </w:p>
     <w:p>
@@ -2199,13 +2113,12 @@
           <w:i w:val="0"/>
           <w:sz w:val="20"/>
         </w:rPr>
-        <w:t>Notably, specific safety prompts reduce the functional pass rate from 53.6% to 33.2%, suggesting a trade-off between security and functionality: security-aware prompts cause models to generate more complex code that is more likely to fail functional tests but significantly more secure when it works. This finding has immediate practical implications: organizations deploying AI-generated code should always include specific, vulnerability-aware safety prompts in their generation pipelines.</w:t>
+        <w:t>CWE-693 (missing security headers) dominated, appearing in 88.7% of functional applications. AI models rarely add middleware like helmet.js or flask-talisman unless told to. Injection attacks were rare—just 1 SQL injection in 3,686 tests—suggesting that models have learned to use parameterized queries. JavaScript-Express applications were far more secure than Flask or Go-Fiber: 223 of 248 secure apps (89.9%) used Express, likely reflecting better security middleware in the Node.js ecosystem.</w:t>
       </w:r>
     </w:p>
     <w:p>
       <w:pPr>
         <w:spacing w:before="160" w:after="80"/>
-        <w:ind w:firstLine="0"/>
       </w:pPr>
       <w:r>
         <w:rPr>
@@ -2214,13 +2127,13 @@
           <w:i/>
           <w:sz w:val="20"/>
         </w:rPr>
-        <w:t>D. Vulnerability Distribution</w:t>
+        <w:t>E. OWASP ZAP: Why Industry Scanners Fall Short</w:t>
       </w:r>
     </w:p>
     <w:p>
       <w:pPr>
         <w:spacing w:before="0" w:after="40"/>
-        <w:ind w:firstLine="283"/>
+        <w:ind w:firstLine="0"/>
         <w:jc w:val="both"/>
       </w:pPr>
       <w:r>
@@ -2230,53 +2143,7 @@
           <w:i w:val="0"/>
           <w:sz w:val="20"/>
         </w:rPr>
-        <w:t>CWE-693 (Protection Mechanism Failure, primarily missing security headers) accounts for the majority of vulnerability occurrences, present in 88.7% of functional applications. This dominance reflects a systematic failure of AI models to add security middleware (e.g., helmet.js for Express, flask-talisman for Flask) unless explicitly instructed. Injection vulnerabilities were rare: only 1 SQL injection instance was detected across 3,686 test cases, suggesting that AI models have effectively learned to use parameterized queries.</w:t>
-      </w:r>
-    </w:p>
-    <w:p>
-      <w:pPr>
-        <w:spacing w:before="160" w:after="80"/>
-        <w:ind w:firstLine="0"/>
-      </w:pPr>
-      <w:r>
-        <w:rPr>
-          <w:rFonts w:ascii="Times New Roman" w:hAnsi="Times New Roman"/>
-          <w:b w:val="0"/>
-          <w:i/>
-          <w:sz w:val="20"/>
-        </w:rPr>
-        <w:t>E. Framework Comparison</w:t>
-      </w:r>
-    </w:p>
-    <w:p>
-      <w:pPr>
-        <w:spacing w:before="0" w:after="40"/>
-        <w:ind w:firstLine="283"/>
-        <w:jc w:val="both"/>
-      </w:pPr>
-      <w:r>
-        <w:rPr>
-          <w:rFonts w:ascii="Times New Roman" w:hAnsi="Times New Roman"/>
-          <w:b w:val="0"/>
-          <w:i w:val="0"/>
-          <w:sz w:val="20"/>
-        </w:rPr>
-        <w:t>JavaScript-Express applications demonstrated significantly better security outcomes than Python-Flask or Go-Fiber applications. Of the 248 secure applications, 223 (89.9%) were Express applications. This disparity likely reflects the broader security-focused ecosystem in Node.js (e.g., helmet.js, express-rate-limit) and more extensive security-aware training data.</w:t>
-      </w:r>
-    </w:p>
-    <w:p>
-      <w:pPr>
-        <w:spacing w:before="160" w:after="80"/>
-        <w:ind w:firstLine="0"/>
-      </w:pPr>
-      <w:r>
-        <w:rPr>
-          <w:rFonts w:ascii="Times New Roman" w:hAnsi="Times New Roman"/>
-          <w:b w:val="0"/>
-          <w:i/>
-          <w:sz w:val="20"/>
-        </w:rPr>
-        <w:t>F. OWASP ZAP Validation</w:t>
+        <w:t>We gave ZAP every advantage: baseline, full scan, and API scan with the OpenAPI spec imported. The result was the same across all three modes: 14.3% agreement with CodeStrike. ZAP reliably found missing headers (CWE-693) and error leakage (CWE-209), but missed every injection, CSRF, authentication, and business logic vulnerability.</w:t>
       </w:r>
     </w:p>
     <w:p>
@@ -2325,7 +2192,7 @@
                 <w:i w:val="0"/>
                 <w:sz w:val="16"/>
               </w:rPr>
-              <w:t>ZAP Scan Mode</w:t>
+              <w:t>ZAP Mode</w:t>
             </w:r>
           </w:p>
         </w:tc>
@@ -2345,7 +2212,7 @@
                 <w:i w:val="0"/>
                 <w:sz w:val="16"/>
               </w:rPr>
-              <w:t>Apps Scanned</w:t>
+              <w:t>Apps</w:t>
             </w:r>
           </w:p>
         </w:tc>
@@ -2639,7 +2506,7 @@
     </w:tbl>
     <w:p>
       <w:pPr>
-        <w:spacing w:before="80" w:after="40"/>
+        <w:spacing w:before="80"/>
       </w:pPr>
     </w:p>
     <w:p>
@@ -2655,13 +2522,27 @@
           <w:i w:val="0"/>
           <w:sz w:val="20"/>
         </w:rPr>
-        <w:t>OWASP ZAP achieved only 14.3% agreement with CodeStrike across all three scan modes. ZAP consistently detected missing security headers (CWE-693) and error information leakage (CWE-209) but failed to detect any injection vulnerabilities, CSRF issues, authentication bypasses, or business logic flaws.</w:t>
+        <w:t>The root cause is architectural. ZAP's XSS scanner looks for reflected HTML in responses—but our apps return JSON, so the check passes even when payloads are stored unsanitized in the database. ZAP cannot access the SQLite database inside Docker to check password hashing. It has no concept of multi-user sessions, so it cannot test IDOR or privilege escalation. And it has no built-in brute-force detection rule. These are not configuration problems; they are fundamental limitations of scanning JSON APIs from outside the container.</w:t>
+      </w:r>
+    </w:p>
+    <w:p>
+      <w:pPr>
+        <w:spacing w:before="160" w:after="80"/>
+      </w:pPr>
+      <w:r>
+        <w:rPr>
+          <w:rFonts w:ascii="Times New Roman" w:hAnsi="Times New Roman"/>
+          <w:b w:val="0"/>
+          <w:i/>
+          <w:sz w:val="20"/>
+        </w:rPr>
+        <w:t>F. Manual Testing: Ground Truth</w:t>
       </w:r>
     </w:p>
     <w:p>
       <w:pPr>
         <w:spacing w:before="0" w:after="40"/>
-        <w:ind w:firstLine="283"/>
+        <w:ind w:firstLine="0"/>
         <w:jc w:val="both"/>
       </w:pPr>
       <w:r>
@@ -2671,22 +2552,62 @@
           <w:i w:val="0"/>
           <w:sz w:val="20"/>
         </w:rPr>
-        <w:t>This poor performance is attributable to architectural limitations of DAST scanning on JSON API applications. ZAP's XSS scanner sends payloads and checks for reflected HTML in responses, but JSON APIs return structured responses so ZAP's reflected XSS check passes even when payloads are stored unsanitized. ZAP also cannot access databases inside Docker containers to verify password hashing, cannot test IDOR because it lacks multi-user context, and has no built-in rule for rate-limiting detection.</w:t>
+        <w:t>Manual penetration testing of 10 applications uncovered 47 vulnerabilities across 12 CWE types. CodeStrike's automated tests had detected 11 of those—all confirmed as true positives, with zero false positives. That gives CodeStrike 100% precision and 23.4% recall. The 36 vulnerabilities that only manual testing found fell into categories that inherently require human judgment: hardcoded secrets visible only in source code, missing access controls that require understanding application logic, race conditions, and business logic flaws like shared global carts.</w:t>
       </w:r>
     </w:p>
     <w:p>
       <w:pPr>
-        <w:spacing w:before="160" w:after="80"/>
-        <w:ind w:firstLine="0"/>
+        <w:spacing w:before="120" w:after="40"/>
+        <w:jc w:val="center"/>
+      </w:pPr>
+      <w:r>
+        <w:drawing>
+          <wp:inline xmlns:a="http://schemas.openxmlformats.org/drawingml/2006/main" xmlns:pic="http://schemas.openxmlformats.org/drawingml/2006/picture">
+            <wp:extent cx="3017520" cy="2426716"/>
+            <wp:docPr id="4" name="Picture 4"/>
+            <wp:cNvGraphicFramePr>
+              <a:graphicFrameLocks noChangeAspect="1"/>
+            </wp:cNvGraphicFramePr>
+            <a:graphic>
+              <a:graphicData uri="http://schemas.openxmlformats.org/drawingml/2006/picture">
+                <pic:pic>
+                  <pic:nvPicPr>
+                    <pic:cNvPr id="0" name="fig4_three_way_comparison.png"/>
+                    <pic:cNvPicPr/>
+                  </pic:nvPicPr>
+                  <pic:blipFill>
+                    <a:blip r:embed="rId12"/>
+                    <a:stretch>
+                      <a:fillRect/>
+                    </a:stretch>
+                  </pic:blipFill>
+                  <pic:spPr>
+                    <a:xfrm>
+                      <a:off x="0" y="0"/>
+                      <a:ext cx="3017520" cy="2426716"/>
+                    </a:xfrm>
+                    <a:prstGeom prst="rect"/>
+                  </pic:spPr>
+                </pic:pic>
+              </a:graphicData>
+            </a:graphic>
+          </wp:inline>
+        </w:drawing>
+      </w:r>
+    </w:p>
+    <w:p>
+      <w:pPr>
+        <w:spacing w:before="40" w:after="120"/>
+        <w:jc w:val="center"/>
       </w:pPr>
       <w:r>
         <w:rPr>
           <w:rFonts w:ascii="Times New Roman" w:hAnsi="Times New Roman"/>
           <w:b w:val="0"/>
-          <w:i/>
-          <w:sz w:val="20"/>
+          <w:i w:val="0"/>
+          <w:sz w:val="16"/>
         </w:rPr>
-        <w:t>G. Manual Penetration Testing Validation</w:t>
+        <w:t>Fig. 4. Three-layer vulnerability detection comparison across 12 CWE types. Manual testing detects all vulnerability categories; automated tools each cover a narrow subset.</w:t>
       </w:r>
     </w:p>
     <w:p>
@@ -2817,7 +2738,7 @@
                 <w:i w:val="0"/>
                 <w:sz w:val="16"/>
               </w:rPr>
-              <w:t>True Positives (CodeStrike + Manual)</w:t>
+              <w:t>True Positives (confirmed by both)</w:t>
             </w:r>
           </w:p>
         </w:tc>
@@ -2859,7 +2780,7 @@
                 <w:i w:val="0"/>
                 <w:sz w:val="16"/>
               </w:rPr>
-              <w:t>False Negatives (Manual only)</w:t>
+              <w:t>False Negatives (manual only)</w:t>
             </w:r>
           </w:p>
         </w:tc>
@@ -2901,7 +2822,7 @@
                 <w:i w:val="0"/>
                 <w:sz w:val="16"/>
               </w:rPr>
-              <w:t>False Positives (CodeStrike only)</w:t>
+              <w:t>False Positives</w:t>
             </w:r>
           </w:p>
         </w:tc>
@@ -3013,24 +2934,8 @@
     </w:tbl>
     <w:p>
       <w:pPr>
-        <w:spacing w:before="80" w:after="40"/>
+        <w:spacing w:before="80"/>
       </w:pPr>
-    </w:p>
-    <w:p>
-      <w:pPr>
-        <w:spacing w:before="0" w:after="40"/>
-        <w:ind w:firstLine="283"/>
-        <w:jc w:val="both"/>
-      </w:pPr>
-      <w:r>
-        <w:rPr>
-          <w:rFonts w:ascii="Times New Roman" w:hAnsi="Times New Roman"/>
-          <w:b w:val="0"/>
-          <w:i w:val="0"/>
-          <w:sz w:val="20"/>
-        </w:rPr>
-        <w:t>Manual penetration testing served as ground truth for evaluating automated detection accuracy. Across 10 applications tested by two penetration testers using the OWASP WSTG v4.2 methodology, 47 vulnerabilities were identified spanning 12 unique CWE types. CodeStrike's automated tests achieved 100% precision (zero false positives) but only 23.4% recall, confirming that the automated findings are reliable but incomplete.</w:t>
-      </w:r>
     </w:p>
     <w:p>
       <w:pPr>
@@ -4082,322 +3987,30 @@
           </w:p>
         </w:tc>
       </w:tr>
-      <w:tr>
-        <w:tc>
-          <w:tcPr>
-            <w:tcW w:type="dxa" w:w="2025"/>
-          </w:tcPr>
-          <w:p>
-            <w:pPr>
-              <w:jc w:val="center"/>
-            </w:pPr>
-            <w:r/>
-            <w:r>
-              <w:rPr>
-                <w:rFonts w:ascii="Times New Roman" w:hAnsi="Times New Roman"/>
-                <w:b w:val="0"/>
-                <w:i w:val="0"/>
-                <w:sz w:val="16"/>
-              </w:rPr>
-              <w:t>CWE-840</w:t>
-            </w:r>
-          </w:p>
-        </w:tc>
-        <w:tc>
-          <w:tcPr>
-            <w:tcW w:type="dxa" w:w="2025"/>
-          </w:tcPr>
-          <w:p>
-            <w:pPr>
-              <w:jc w:val="center"/>
-            </w:pPr>
-            <w:r/>
-            <w:r>
-              <w:rPr>
-                <w:rFonts w:ascii="Times New Roman" w:hAnsi="Times New Roman"/>
-                <w:b w:val="0"/>
-                <w:i w:val="0"/>
-                <w:sz w:val="16"/>
-              </w:rPr>
-              <w:t>Business Logic</w:t>
-            </w:r>
-          </w:p>
-        </w:tc>
-        <w:tc>
-          <w:tcPr>
-            <w:tcW w:type="dxa" w:w="2025"/>
-          </w:tcPr>
-          <w:p>
-            <w:pPr>
-              <w:jc w:val="center"/>
-            </w:pPr>
-            <w:r/>
-            <w:r>
-              <w:rPr>
-                <w:rFonts w:ascii="Times New Roman" w:hAnsi="Times New Roman"/>
-                <w:b w:val="0"/>
-                <w:i w:val="0"/>
-                <w:sz w:val="16"/>
-              </w:rPr>
-              <w:t>0/1</w:t>
-            </w:r>
-          </w:p>
-        </w:tc>
-        <w:tc>
-          <w:tcPr>
-            <w:tcW w:type="dxa" w:w="2025"/>
-          </w:tcPr>
-          <w:p>
-            <w:pPr>
-              <w:jc w:val="center"/>
-            </w:pPr>
-            <w:r/>
-            <w:r>
-              <w:rPr>
-                <w:rFonts w:ascii="Times New Roman" w:hAnsi="Times New Roman"/>
-                <w:b w:val="0"/>
-                <w:i w:val="0"/>
-                <w:sz w:val="16"/>
-              </w:rPr>
-              <w:t>0/1</w:t>
-            </w:r>
-          </w:p>
-        </w:tc>
-        <w:tc>
-          <w:tcPr>
-            <w:tcW w:type="dxa" w:w="2025"/>
-          </w:tcPr>
-          <w:p>
-            <w:pPr>
-              <w:jc w:val="center"/>
-            </w:pPr>
-            <w:r/>
-            <w:r>
-              <w:rPr>
-                <w:rFonts w:ascii="Times New Roman" w:hAnsi="Times New Roman"/>
-                <w:b w:val="0"/>
-                <w:i w:val="0"/>
-                <w:sz w:val="16"/>
-              </w:rPr>
-              <w:t>1/1</w:t>
-            </w:r>
-          </w:p>
-        </w:tc>
-      </w:tr>
-      <w:tr>
-        <w:tc>
-          <w:tcPr>
-            <w:tcW w:type="dxa" w:w="2025"/>
-          </w:tcPr>
-          <w:p>
-            <w:pPr>
-              <w:jc w:val="center"/>
-            </w:pPr>
-            <w:r/>
-            <w:r>
-              <w:rPr>
-                <w:rFonts w:ascii="Times New Roman" w:hAnsi="Times New Roman"/>
-                <w:b w:val="0"/>
-                <w:i w:val="0"/>
-                <w:sz w:val="16"/>
-              </w:rPr>
-              <w:t>CWE-640</w:t>
-            </w:r>
-          </w:p>
-        </w:tc>
-        <w:tc>
-          <w:tcPr>
-            <w:tcW w:type="dxa" w:w="2025"/>
-          </w:tcPr>
-          <w:p>
-            <w:pPr>
-              <w:jc w:val="center"/>
-            </w:pPr>
-            <w:r/>
-            <w:r>
-              <w:rPr>
-                <w:rFonts w:ascii="Times New Roman" w:hAnsi="Times New Roman"/>
-                <w:b w:val="0"/>
-                <w:i w:val="0"/>
-                <w:sz w:val="16"/>
-              </w:rPr>
-              <w:t>Weak Recovery</w:t>
-            </w:r>
-          </w:p>
-        </w:tc>
-        <w:tc>
-          <w:tcPr>
-            <w:tcW w:type="dxa" w:w="2025"/>
-          </w:tcPr>
-          <w:p>
-            <w:pPr>
-              <w:jc w:val="center"/>
-            </w:pPr>
-            <w:r/>
-            <w:r>
-              <w:rPr>
-                <w:rFonts w:ascii="Times New Roman" w:hAnsi="Times New Roman"/>
-                <w:b w:val="0"/>
-                <w:i w:val="0"/>
-                <w:sz w:val="16"/>
-              </w:rPr>
-              <w:t>0/1</w:t>
-            </w:r>
-          </w:p>
-        </w:tc>
-        <w:tc>
-          <w:tcPr>
-            <w:tcW w:type="dxa" w:w="2025"/>
-          </w:tcPr>
-          <w:p>
-            <w:pPr>
-              <w:jc w:val="center"/>
-            </w:pPr>
-            <w:r/>
-            <w:r>
-              <w:rPr>
-                <w:rFonts w:ascii="Times New Roman" w:hAnsi="Times New Roman"/>
-                <w:b w:val="0"/>
-                <w:i w:val="0"/>
-                <w:sz w:val="16"/>
-              </w:rPr>
-              <w:t>0/1</w:t>
-            </w:r>
-          </w:p>
-        </w:tc>
-        <w:tc>
-          <w:tcPr>
-            <w:tcW w:type="dxa" w:w="2025"/>
-          </w:tcPr>
-          <w:p>
-            <w:pPr>
-              <w:jc w:val="center"/>
-            </w:pPr>
-            <w:r/>
-            <w:r>
-              <w:rPr>
-                <w:rFonts w:ascii="Times New Roman" w:hAnsi="Times New Roman"/>
-                <w:b w:val="0"/>
-                <w:i w:val="0"/>
-                <w:sz w:val="16"/>
-              </w:rPr>
-              <w:t>1/1</w:t>
-            </w:r>
-          </w:p>
-        </w:tc>
-      </w:tr>
-      <w:tr>
-        <w:tc>
-          <w:tcPr>
-            <w:tcW w:type="dxa" w:w="2025"/>
-          </w:tcPr>
-          <w:p>
-            <w:pPr>
-              <w:jc w:val="center"/>
-            </w:pPr>
-            <w:r/>
-            <w:r>
-              <w:rPr>
-                <w:rFonts w:ascii="Times New Roman" w:hAnsi="Times New Roman"/>
-                <w:b w:val="0"/>
-                <w:i w:val="0"/>
-                <w:sz w:val="16"/>
-              </w:rPr>
-              <w:t>CWE-20</w:t>
-            </w:r>
-          </w:p>
-        </w:tc>
-        <w:tc>
-          <w:tcPr>
-            <w:tcW w:type="dxa" w:w="2025"/>
-          </w:tcPr>
-          <w:p>
-            <w:pPr>
-              <w:jc w:val="center"/>
-            </w:pPr>
-            <w:r/>
-            <w:r>
-              <w:rPr>
-                <w:rFonts w:ascii="Times New Roman" w:hAnsi="Times New Roman"/>
-                <w:b w:val="0"/>
-                <w:i w:val="0"/>
-                <w:sz w:val="16"/>
-              </w:rPr>
-              <w:t>Input Validation</w:t>
-            </w:r>
-          </w:p>
-        </w:tc>
-        <w:tc>
-          <w:tcPr>
-            <w:tcW w:type="dxa" w:w="2025"/>
-          </w:tcPr>
-          <w:p>
-            <w:pPr>
-              <w:jc w:val="center"/>
-            </w:pPr>
-            <w:r/>
-            <w:r>
-              <w:rPr>
-                <w:rFonts w:ascii="Times New Roman" w:hAnsi="Times New Roman"/>
-                <w:b w:val="0"/>
-                <w:i w:val="0"/>
-                <w:sz w:val="16"/>
-              </w:rPr>
-              <w:t>0/2</w:t>
-            </w:r>
-          </w:p>
-        </w:tc>
-        <w:tc>
-          <w:tcPr>
-            <w:tcW w:type="dxa" w:w="2025"/>
-          </w:tcPr>
-          <w:p>
-            <w:pPr>
-              <w:jc w:val="center"/>
-            </w:pPr>
-            <w:r/>
-            <w:r>
-              <w:rPr>
-                <w:rFonts w:ascii="Times New Roman" w:hAnsi="Times New Roman"/>
-                <w:b w:val="0"/>
-                <w:i w:val="0"/>
-                <w:sz w:val="16"/>
-              </w:rPr>
-              <w:t>0/2</w:t>
-            </w:r>
-          </w:p>
-        </w:tc>
-        <w:tc>
-          <w:tcPr>
-            <w:tcW w:type="dxa" w:w="2025"/>
-          </w:tcPr>
-          <w:p>
-            <w:pPr>
-              <w:jc w:val="center"/>
-            </w:pPr>
-            <w:r/>
-            <w:r>
-              <w:rPr>
-                <w:rFonts w:ascii="Times New Roman" w:hAnsi="Times New Roman"/>
-                <w:b w:val="0"/>
-                <w:i w:val="0"/>
-                <w:sz w:val="16"/>
-              </w:rPr>
-              <w:t>2/2</w:t>
-            </w:r>
-          </w:p>
-        </w:tc>
-      </w:tr>
     </w:tbl>
     <w:p>
       <w:pPr>
-        <w:spacing w:before="80" w:after="40"/>
+        <w:spacing w:before="80"/>
       </w:pPr>
     </w:p>
     <w:p>
       <w:pPr>
+        <w:spacing w:before="160" w:after="80"/>
+      </w:pPr>
+      <w:r>
+        <w:rPr>
+          <w:rFonts w:ascii="Times New Roman" w:hAnsi="Times New Roman"/>
+          <w:b w:val="0"/>
+          <w:i/>
+          <w:sz w:val="20"/>
+        </w:rPr>
+        <w:t>G. Precision vs. Recall Trade-off</w:t>
+      </w:r>
+    </w:p>
+    <w:p>
+      <w:pPr>
         <w:spacing w:before="0" w:after="40"/>
-        <w:ind w:firstLine="283"/>
+        <w:ind w:firstLine="0"/>
         <w:jc w:val="both"/>
       </w:pPr>
       <w:r>
@@ -4407,13 +4020,67 @@
           <w:i w:val="0"/>
           <w:sz w:val="20"/>
         </w:rPr>
-        <w:t>The categories with 0% automated detection (hardcoded credentials, missing access control, SSRF, business logic) represent vulnerability types that require source code review or contextual understanding of application logic — capabilities inherent to human testers but absent from both CodeStrike and ZAP.</w:t>
+        <w:t>Fig. 5 summarizes the trade-off between the three methods. All three have high precision—when they flag something, it is real. But recall varies dramatically. ZAP catches only what it can see from outside the container (mostly headers). CodeStrike reaches deeper—into the database, into session logic—but still misses what requires reading code or understanding business context. Only manual testing covers the full range, which is why we argue that layered validation is essential.</w:t>
+      </w:r>
+    </w:p>
+    <w:p>
+      <w:pPr>
+        <w:spacing w:before="120" w:after="40"/>
+        <w:jc w:val="center"/>
+      </w:pPr>
+      <w:r>
+        <w:drawing>
+          <wp:inline xmlns:a="http://schemas.openxmlformats.org/drawingml/2006/main" xmlns:pic="http://schemas.openxmlformats.org/drawingml/2006/picture">
+            <wp:extent cx="3017520" cy="1564528"/>
+            <wp:docPr id="5" name="Picture 5"/>
+            <wp:cNvGraphicFramePr>
+              <a:graphicFrameLocks noChangeAspect="1"/>
+            </wp:cNvGraphicFramePr>
+            <a:graphic>
+              <a:graphicData uri="http://schemas.openxmlformats.org/drawingml/2006/picture">
+                <pic:pic>
+                  <pic:nvPicPr>
+                    <pic:cNvPr id="0" name="fig5_precision_recall.png"/>
+                    <pic:cNvPicPr/>
+                  </pic:nvPicPr>
+                  <pic:blipFill>
+                    <a:blip r:embed="rId13"/>
+                    <a:stretch>
+                      <a:fillRect/>
+                    </a:stretch>
+                  </pic:blipFill>
+                  <pic:spPr>
+                    <a:xfrm>
+                      <a:off x="0" y="0"/>
+                      <a:ext cx="3017520" cy="1564528"/>
+                    </a:xfrm>
+                    <a:prstGeom prst="rect"/>
+                  </pic:spPr>
+                </pic:pic>
+              </a:graphicData>
+            </a:graphic>
+          </wp:inline>
+        </w:drawing>
+      </w:r>
+    </w:p>
+    <w:p>
+      <w:pPr>
+        <w:spacing w:before="40" w:after="120"/>
+        <w:jc w:val="center"/>
+      </w:pPr>
+      <w:r>
+        <w:rPr>
+          <w:rFonts w:ascii="Times New Roman" w:hAnsi="Times New Roman"/>
+          <w:b w:val="0"/>
+          <w:i w:val="0"/>
+          <w:sz w:val="16"/>
+        </w:rPr>
+        <w:t>Fig. 5. Precision vs. recall for each detection method. All methods have high precision, but recall ranges from 14.3% (ZAP) to 100% (manual).</w:t>
       </w:r>
     </w:p>
     <w:p>
       <w:pPr>
         <w:spacing w:before="160" w:after="80"/>
-        <w:ind w:firstLine="0"/>
       </w:pPr>
       <w:r>
         <w:rPr>
@@ -4422,7 +4089,7 @@
           <w:i/>
           <w:sz w:val="20"/>
         </w:rPr>
-        <w:t>H. Notable Application-Level Findings</w:t>
+        <w:t>H. What the Models Got Right</w:t>
       </w:r>
     </w:p>
     <w:p>
@@ -4438,7 +4105,7 @@
           <w:i w:val="0"/>
           <w:sz w:val="20"/>
         </w:rPr>
-        <w:t>Manual testing revealed significant variation in code quality across models. The opus-4.1-thinking model produced the most secure code for MultiUserNotes, with proper IDOR prevention via server-side ownership verification. The sonnet-4-thinking model used a recursive descent parser for Calculator (Go), preventing code injection entirely. Conversely, haiku-4.5-standard / Login contained a hardcoded JWT secret ("secret"), no rate limiting, and debug mode enabled. These findings demonstrate that model selection significantly impacts security outcomes.</w:t>
+        <w:t>Not all the news is bad. The opus-4.1-thinking model produced genuinely secure authorization logic for MultiUserNotes—proper server-side ownership checks that prevented IDOR, with only 3 minor findings. The sonnet-4-thinking model wrote a recursive descent parser for Calculator in Go, completely avoiding the code injection risk that eval() would have introduced. And across the board, AI models have largely learned to use parameterized queries (just 1 SQLi in 3,686 tests). The challenge is not that models cannot write secure code—it is that they do not do so consistently without explicit instructions.</w:t>
       </w:r>
     </w:p>
     <w:p>
@@ -4460,7 +4127,7 @@
     <w:p>
       <w:pPr>
         <w:spacing w:before="0" w:after="40"/>
-        <w:ind w:firstLine="283"/>
+        <w:ind w:firstLine="0"/>
         <w:jc w:val="both"/>
       </w:pPr>
       <w:r>
@@ -4470,7 +4137,7 @@
           <w:i w:val="0"/>
           <w:sz w:val="20"/>
         </w:rPr>
-        <w:t>This study presents CodeStrike, a three-layer security benchmark demonstrating that AI-generated web application code remains overwhelmingly insecure. With only 6.7% of applications achieving sec_pass@1, our findings confirm and extend prior work [2]–[5] while providing several new contributions:</w:t>
+        <w:t>We evaluated 20 AI model configurations across 3,686 test cases and validated the results with OWASP ZAP and manual penetration testing. Five findings stand out:</w:t>
       </w:r>
     </w:p>
     <w:p>
@@ -4486,7 +4153,7 @@
           <w:i w:val="0"/>
           <w:sz w:val="20"/>
         </w:rPr>
-        <w:t>1) Safety prompts are critical: specific, vulnerability-aware safety prompts improve sec_pass@1 from 0.0% to 21.0%. Generic prompts are ineffective. This is the most actionable finding for practitioners.</w:t>
+        <w:t>First, specific safety prompts matter enormously. They raise sec_pass@1 from 0.0% to 21.0%. Generic prompts do almost nothing. Anyone generating code with an LLM should include detailed, vulnerability-aware instructions—not vague advice like "be secure."</w:t>
       </w:r>
     </w:p>
     <w:p>
@@ -4502,7 +4169,7 @@
           <w:i w:val="0"/>
           <w:sz w:val="20"/>
         </w:rPr>
-        <w:t>2) Industry scanners are insufficient: OWASP ZAP achieves only 14.3% agreement with CodeStrike on JSON API applications, due to fundamental architectural limitations of DAST tools applied to API backends.</w:t>
+        <w:t>Second, industry scanners are not enough. OWASP ZAP agreed with only 14.3% of our findings. This is not a ZAP configuration issue; it is a fundamental limitation of scanning JSON APIs from outside the application container.</w:t>
       </w:r>
     </w:p>
     <w:p>
@@ -4518,7 +4185,7 @@
           <w:i w:val="0"/>
           <w:sz w:val="20"/>
         </w:rPr>
-        <w:t>3) Layered testing is essential: no single method provides comprehensive coverage. Automated testing achieves 100% precision but 23.4% recall; manual testing captures the remaining 76.6%.</w:t>
+        <w:t>Third, layered testing is necessary. Automated testing gave us 100% precision but only 23.4% recall. Manual testing caught the remaining 76.6%. No single method covers everything.</w:t>
       </w:r>
     </w:p>
     <w:p>
@@ -4534,7 +4201,7 @@
           <w:i w:val="0"/>
           <w:sz w:val="20"/>
         </w:rPr>
-        <w:t>4) Thinking mode provides modest benefits: thinking-mode models average +2.1pp improvement in sec_pass@1, but the effect is inconsistent across models.</w:t>
+        <w:t>Fourth, thinking mode helps, but not always. Thinking-mode models averaged +2.1pp in sec_pass@1, but the improvement was inconsistent across model families.</w:t>
       </w:r>
     </w:p>
     <w:p>
@@ -4550,7 +4217,7 @@
           <w:i w:val="0"/>
           <w:sz w:val="20"/>
         </w:rPr>
-        <w:t>5) Framework choice matters: JavaScript-Express produces significantly more secure applications than Python-Flask or Go-Fiber, likely due to richer security middleware ecosystems.</w:t>
+        <w:t>Fifth, framework choice matters more than expected. Express applications accounted for 89.9% of all secure results, likely because of better security middleware libraries in the Node.js ecosystem.</w:t>
       </w:r>
     </w:p>
     <w:p>
@@ -4566,7 +4233,7 @@
           <w:i w:val="0"/>
           <w:sz w:val="20"/>
         </w:rPr>
-        <w:t>For developers: always include specific safety prompts when using AI code generation and never deploy AI-generated code without security review. For AI providers: train models on security middleware patterns and default to including security headers. For security teams: treat all AI-generated code as untrusted and layer testing methodologies. Future work should expand SAST coverage for hardcoded credentials, add authentication presence checks, and extend the benchmark to additional models and languages.</w:t>
+        <w:t>For future work, we recommend expanding SAST coverage for hardcoded secrets (which alone would have caught 5 more vulnerabilities in our 10-app test set), adding authentication presence checks, and extending the benchmark to non-Claude model families. The CodeStrike dashboard and all results are publicly available at the URL listed in Appendix A.</w:t>
       </w:r>
     </w:p>
     <w:p>
@@ -4598,7 +4265,7 @@
           <w:i w:val="0"/>
           <w:sz w:val="20"/>
         </w:rPr>
-        <w:t>The authors thank Thompson Rivers University and the COMP 4210 Ethical Hacking course for providing the academic framework for this research. The CodeStrike framework extends the BaxBench benchmark [4] developed by Logic Star AI and ETH Zurich.</w:t>
+        <w:t>The authors thank Thompson Rivers University and the COMP 4210 Ethical Hacking course for supporting this research. CodeStrike extends the BaxBench framework [4] developed by Vero et al. at ETH Zurich.</w:t>
       </w:r>
     </w:p>
     <w:p>
@@ -4629,7 +4296,7 @@
           <w:i w:val="0"/>
           <w:sz w:val="16"/>
         </w:rPr>
-        <w:t>[1] GitHub, "The state of AI in software development," GitHub Blog, 2025. [Online]. Available: https://github.blog/news-insights/octoverse/octoverse-2024/</w:t>
+        <w:t>[1] GitHub, "Octoverse 2024: The state of open source and AI," GitHub Blog, Oct. 2024. [Online]. Available: https://github.blog/news-insights/octoverse/octoverse-2024/</w:t>
       </w:r>
     </w:p>
     <w:p>
@@ -4644,7 +4311,7 @@
           <w:i w:val="0"/>
           <w:sz w:val="16"/>
         </w:rPr>
-        <w:t>[2] H. Pearce, B. Ahmad, B. Tan, B. Dolan-Gavitt, and R. Karri, "Asleep at the keyboard? Assessing the security of GitHub Copilot's code contributions," in Proc. IEEE Symp. Security and Privacy (S&amp;P), San Francisco, CA, USA, 2022, pp. 754-768.</w:t>
+        <w:t>[2] H. Pearce, B. Ahmad, B. Tan, B. Dolan-Gavitt, and R. Karri, "Asleep at the keyboard? Assessing the security of GitHub Copilot's code contributions," in Proc. IEEE Symp. Security and Privacy (S&amp;P), San Francisco, CA, USA, May 2022, pp. 754–768. doi: 10.1109/SP46214.2022.9833571</w:t>
       </w:r>
     </w:p>
     <w:p>
@@ -4659,7 +4326,7 @@
           <w:i w:val="0"/>
           <w:sz w:val="16"/>
         </w:rPr>
-        <w:t>[3] N. Perry, M. Srivastava, D. Kumar, and D. Boneh, "Do users write more insecure code with AI assistants?" in Proc. ACM SIGSAC Conf. Computer and Communications Security (CCS), Copenhagen, Denmark, 2023, pp. 2785-2799.</w:t>
+        <w:t>[3] N. Perry, M. Srivastava, D. Kumar, and D. Boneh, "Do users write more insecure code with AI assistants?" in Proc. ACM SIGSAC Conf. Computer and Communications Security (CCS), Copenhagen, Denmark, Nov. 2023, pp. 2785–2799. doi: 10.1145/3576915.3623157</w:t>
       </w:r>
     </w:p>
     <w:p>
@@ -4674,7 +4341,7 @@
           <w:i w:val="0"/>
           <w:sz w:val="16"/>
         </w:rPr>
-        <w:t>[4] M. Vero, M. Muller, M. Fischer, and M. Vechev, "BaxBench: Can LLMs generate correct and secure backends?" in Proc. Int. Conf. Machine Learning (ICML), 2025. [Online]. Available: https://arxiv.org/abs/2502.11844</w:t>
+        <w:t>[4] M. Vero, M. Müller, M. Fischer, and M. Vechev, "BaxBench: Can LLMs generate correct and secure backends?" in Proc. Int. Conf. Machine Learning (ICML), 2025. [Online]. Available: https://arxiv.org/abs/2502.11844</w:t>
       </w:r>
     </w:p>
     <w:p>
@@ -4689,7 +4356,7 @@
           <w:i w:val="0"/>
           <w:sz w:val="16"/>
         </w:rPr>
-        <w:t>[5] M. Bhatt, S. Chennabasappa, C. Nikolaidis, S. Wan, I. Evtimov, D. Gabi, D. Song, F. Ahmad, and S. Oprea, "CyberSecEval: A secure coding benchmark for language models," in Proc. IEEE Conf. Secure and Trustworthy Machine Learning (SaTML), 2024.</w:t>
+        <w:t>[5] M. Bhatt et al., "CyberSecEval: A secure coding benchmark for language models," Meta AI, Dec. 2023. [Online]. Available: https://arxiv.org/abs/2312.04724</w:t>
       </w:r>
     </w:p>
     <w:p>
@@ -4704,7 +4371,7 @@
           <w:i w:val="0"/>
           <w:sz w:val="16"/>
         </w:rPr>
-        <w:t>[6] OWASP Foundation, "OWASP Top 10:2021 -- The ten most critical web application security risks," 2021. [Online]. Available: https://owasp.org/Top10/</w:t>
+        <w:t>[6] OWASP Foundation, "OWASP Top 10:2021 – The ten most critical web application security risks," 2021. [Online]. Available: https://owasp.org/Top10/</w:t>
       </w:r>
     </w:p>
     <w:p>
@@ -4719,7 +4386,7 @@
           <w:i w:val="0"/>
           <w:sz w:val="16"/>
         </w:rPr>
-        <w:t>[7] OWASP Foundation, "OWASP ZAP -- Zed Attack Proxy," 2024. [Online]. Available: https://www.zaproxy.org/</w:t>
+        <w:t>[7] OWASP Foundation, "OWASP ZAP – Zed Attack Proxy." [Online]. Available: https://www.zaproxy.org/</w:t>
       </w:r>
     </w:p>
     <w:p>
@@ -4734,7 +4401,7 @@
           <w:i w:val="0"/>
           <w:sz w:val="16"/>
         </w:rPr>
-        <w:t>[8] J. Bau, E. Bursztein, D. Guber, and J. Mitchell, "State of the art: Automated black-box web application vulnerability testing," in Proc. IEEE Symp. Security and Privacy (S&amp;P), 2010, pp. 332-345.</w:t>
+        <w:t>[8] J. Bau, E. Bursztein, D. Guber, and J. Mitchell, "State of the art: Automated black-box web application vulnerability testing," in Proc. IEEE Symp. Security and Privacy (S&amp;P), Oakland, CA, USA, May 2010, pp. 332–345. doi: 10.1109/SP.2010.27</w:t>
       </w:r>
     </w:p>
     <w:p>
@@ -4749,7 +4416,7 @@
           <w:i w:val="0"/>
           <w:sz w:val="16"/>
         </w:rPr>
-        <w:t>[9] A. Doupe, M. Cova, and G. Vigna, "Why Johnny can't pentest: An analysis of black-box web vulnerability scanners," in Proc. Int. Conf. Detection of Intrusions and Malware, and Vulnerability Assessment (DIMVA), Bonn, Germany, 2010, pp. 111-131.</w:t>
+        <w:t>[9] A. Doupé, M. Cova, and G. Vigna, "Why Johnny can't pentest: An analysis of black-box web vulnerability scanners," in Proc. Int. Conf. Detection of Intrusions and Malware, and Vulnerability Assessment (DIMVA), Bonn, Germany, Jul. 2010, pp. 111–131. doi: 10.1007/978-3-642-14215-4_7</w:t>
       </w:r>
     </w:p>
     <w:p>
@@ -4779,7 +4446,7 @@
           <w:i w:val="0"/>
           <w:sz w:val="16"/>
         </w:rPr>
-        <w:t>[11] PTES Team, "Penetration Testing Execution Standard," 2014. [Online]. Available: http://www.pentest-standard.org/</w:t>
+        <w:t>[11] PTES Team, "Penetration Testing Execution Standard." [Online]. Available: http://www.pentest-standard.org/</w:t>
       </w:r>
     </w:p>
     <w:p>
@@ -4794,7 +4461,7 @@
           <w:i w:val="0"/>
           <w:sz w:val="16"/>
         </w:rPr>
-        <w:t>[12] S. Alneyadi, E. Sithirasenan, and V. Muthukkumarasamy, "A survey on data leakage prevention systems," J. Network and Computer Applications, vol. 62, pp. 137-152, 2016.</w:t>
+        <w:t>[12] N. Antunes and M. Vieira, "Comparing the effectiveness of penetration testing and static code analysis on the detection of SQL injection vulnerabilities in web services," in Proc. IEEE Pacific Rim Int. Symp. Dependable Computing (PRDC), Shanghai, China, Nov. 2009, pp. 301–306. doi: 10.1109/PRDC.2009.54</w:t>
       </w:r>
     </w:p>
     <w:p>
@@ -4809,7 +4476,7 @@
           <w:i w:val="0"/>
           <w:sz w:val="16"/>
         </w:rPr>
-        <w:t>[13] C. Tony, M. Mutas, N. Diaz Ferreyra, and R. Scandariato, "LLMSecEval: A dataset of natural language prompts for security evaluations," in Proc. IEEE/ACM Int. Conf. Mining Software Repositories (MSR), 2023, pp. 588-592.</w:t>
+        <w:t>[13] C. Tony, M. Mutas, N. Díaz Ferreyra, and R. Scandariato, "LLMSecEval: A dataset of natural language prompts for security evaluations," in Proc. IEEE/ACM Int. Conf. Mining Software Repositories (MSR), Melbourne, Australia, May 2023, pp. 588–592. doi: 10.1109/MSR59073.2023.00084</w:t>
       </w:r>
     </w:p>
     <w:p>
@@ -4824,7 +4491,7 @@
           <w:i w:val="0"/>
           <w:sz w:val="16"/>
         </w:rPr>
-        <w:t>[14] N. Antunes and M. Vieira, "Comparing the effectiveness of penetration testing and static code analysis on the detection of SQL injection vulnerabilities in web services," in Proc. IEEE Pacific Rim Int. Symp. Dependable Computing (PRDC), 2009, pp. 301-306.</w:t>
+        <w:t>[14] P. Nunes, I. Medeiros, J. Fonseca, N. Neves, M. Correia, and M. Vieira, "Benchmarking static analysis tools for web security," IEEE Trans. Reliability, vol. 67, no. 3, pp. 1159–1175, Sep. 2018. doi: 10.1109/TR.2018.2839339</w:t>
       </w:r>
     </w:p>
     <w:p>
@@ -4839,7 +4506,7 @@
           <w:i w:val="0"/>
           <w:sz w:val="16"/>
         </w:rPr>
-        <w:t>[15] P. Nunes, I. Medeiros, J. Fonseca, N. Neves, M. Correia, and M. Vieira, "Benchmarking static analysis tools for web security," IEEE Trans. Reliability, vol. 67, no. 3, pp. 1159-1175, Sep. 2018.</w:t>
+        <w:t>[15] NIST, "Artificial Intelligence Risk Management Framework (AI RMF 1.0)," NIST AI 100-1, Gaithersburg, MD, USA, Jan. 2023. [Online]. Available: https://www.nist.gov/artificial-intelligence/executive-order-safe-secure-and-trustworthy-artificial-intelligence</w:t>
       </w:r>
     </w:p>
     <w:p>
@@ -4854,7 +4521,7 @@
           <w:i w:val="0"/>
           <w:sz w:val="16"/>
         </w:rPr>
-        <w:t>[16] NIST, "Artificial Intelligence Risk Management Framework (AI RMF 1.0)," National Institute of Standards and Technology, NIST AI 100-1, Jan. 2023.</w:t>
+        <w:t>[16] NIST, "Secure Software Development Framework (SSDF) Version 1.1," NIST SP 800-218, Gaithersburg, MD, USA, Feb. 2022. [Online]. Available: https://csrc.nist.gov/publications/detail/sp/800-218/final</w:t>
       </w:r>
     </w:p>
     <w:p>
@@ -4869,7 +4536,7 @@
           <w:i w:val="0"/>
           <w:sz w:val="16"/>
         </w:rPr>
-        <w:t>[17] NIST, "Secure Software Development Framework (SSDF) Version 1.1," NIST SP 800-218, Feb. 2022.</w:t>
+        <w:t>[17] R. Khoury, A. R. Avon, J. Whittaker, and G. Neto, "How secure is code generated by ChatGPT?" in Proc. IEEE Int. Conf. Systems, Man, and Cybernetics (SMC), Honolulu, HI, USA, Oct. 2023, pp. 2445–2450. doi: 10.1109/SMC53992.2023.10394237</w:t>
       </w:r>
     </w:p>
     <w:p>
@@ -4884,7 +4551,7 @@
           <w:i w:val="0"/>
           <w:sz w:val="16"/>
         </w:rPr>
-        <w:t>[18] R. Khoury, A. R. Avon, J. Whittaker, and G. Neto, "How secure is code generated by ChatGPT?" in Proc. IEEE Int. Conf. Systems, Man, and Cybernetics (SMC), Honolulu, HI, USA, 2023, pp. 2445-2450.</w:t>
+        <w:t>[18] M. Bhatt et al., "CyberSecEval 2: A wide-ranging cybersecurity evaluation suite for large language models," Meta AI, Apr. 2024. [Online]. Available: https://arxiv.org/abs/2404.13161</w:t>
       </w:r>
     </w:p>
     <w:p>
@@ -4899,7 +4566,7 @@
           <w:i w:val="0"/>
           <w:sz w:val="16"/>
         </w:rPr>
-        <w:t>[19] M. Bhatt, S. Chennabasappa, Y. Li, C. Nikolaidis, D. Song, and S. Wan, "CyberSecEval 2: A wide-ranging cybersecurity evaluation suite for large language models," in Proc. Int. Conf. Learning Representations (ICLR), 2025.</w:t>
+        <w:t>[19] OWASP Foundation, "OWASP Top 10 for Large Language Model Applications," Version 2.0, 2025. [Online]. Available: https://owasp.org/www-project-top-10-for-large-language-model-applications/</w:t>
       </w:r>
     </w:p>
     <w:p>
@@ -4914,37 +4581,7 @@
           <w:i w:val="0"/>
           <w:sz w:val="16"/>
         </w:rPr>
-        <w:t>[20] OWASP Foundation, "OWASP Top 10 for Large Language Model Applications, Version 2025," 2025. [Online]. Available: https://owasp.org/www-project-top-10-for-large-language-model-applications/</w:t>
-      </w:r>
-    </w:p>
-    <w:p>
-      <w:pPr>
-        <w:spacing w:before="0" w:after="20"/>
-        <w:ind w:left="283" w:hanging="283"/>
-      </w:pPr>
-      <w:r>
-        <w:rPr>
-          <w:rFonts w:ascii="Times New Roman" w:hAnsi="Times New Roman"/>
-          <w:b w:val="0"/>
-          <w:i w:val="0"/>
-          <w:sz w:val="16"/>
-        </w:rPr>
-        <w:t>[21] T. Siddiq, S. Santos, L. Tandon, and S. Malaiya, "An empirical study of using large language models for multi-language software vulnerability detection," in Proc. IEEE/ACM Int. Conf. Mining Software Repositories (MSR), 2024.</w:t>
-      </w:r>
-    </w:p>
-    <w:p>
-      <w:pPr>
-        <w:spacing w:before="0" w:after="20"/>
-        <w:ind w:left="283" w:hanging="283"/>
-      </w:pPr>
-      <w:r>
-        <w:rPr>
-          <w:rFonts w:ascii="Times New Roman" w:hAnsi="Times New Roman"/>
-          <w:b w:val="0"/>
-          <w:i w:val="0"/>
-          <w:sz w:val="16"/>
-        </w:rPr>
-        <w:t>[22] M. Chen et al., "Evaluating large language models trained on code," arXiv preprint arXiv:2107.03374, 2021.</w:t>
+        <w:t>[20] M. Chen et al., "Evaluating large language models trained on code," Jul. 2021. [Online]. Available: https://arxiv.org/abs/2107.03374</w:t>
       </w:r>
     </w:p>
     <w:p>
@@ -4960,7 +4597,7 @@
           <w:sz w:val="20"/>
           <w:smallCaps w:val="true"/>
         </w:rPr>
-        <w:t>APPENDIX A: DASHBOARD</w:t>
+        <w:t>APPENDIX A: DASHBOARD AND SOURCE CODE</w:t>
       </w:r>
     </w:p>
     <w:p>
@@ -4976,7 +4613,7 @@
           <w:i w:val="0"/>
           <w:sz w:val="20"/>
         </w:rPr>
-        <w:t>The interactive CodeStrike dashboard is available at: https://dashboard-wheat-iota-87.vercel.app/</w:t>
+        <w:t>Interactive dashboard: https://dashboard-wheat-iota-87.vercel.app/</w:t>
       </w:r>
     </w:p>
     <w:p>
@@ -4992,7 +4629,23 @@
           <w:i w:val="0"/>
           <w:sz w:val="20"/>
         </w:rPr>
-        <w:t>The dashboard provides six pages: Overview (model rankings and vulnerability heatmap), Models (per-model analysis with radar charts), Vulnerabilities (CWE distribution and treemap), Compare (side-by-side safety prompt, framework, and model family comparisons), Pentest (three-way comparison with ZAP and manual results), and Results (browsable test results with prompts, generated code, and test logs). Source code: https://github.com/iyassh/baxbench-extended</w:t>
+        <w:t>Source code repository: https://github.com/iyassh/baxbench-extended</w:t>
+      </w:r>
+    </w:p>
+    <w:p>
+      <w:pPr>
+        <w:spacing w:before="0" w:after="40"/>
+        <w:ind w:firstLine="0"/>
+        <w:jc w:val="both"/>
+      </w:pPr>
+      <w:r>
+        <w:rPr>
+          <w:rFonts w:ascii="Times New Roman" w:hAnsi="Times New Roman"/>
+          <w:b w:val="0"/>
+          <w:i w:val="0"/>
+          <w:sz w:val="20"/>
+        </w:rPr>
+        <w:t>The dashboard provides six pages: Overview (model rankings, heatmap), Models (per-model radar charts), Vulnerabilities (CWE treemap), Compare (safety prompts, frameworks, model families), Pentest (three-way comparison), and Results (browsable test results with prompts, generated code, and logs).</w:t>
       </w:r>
     </w:p>
     <w:p>
@@ -5030,7 +4683,6 @@
     <w:p>
       <w:pPr>
         <w:spacing w:before="80" w:after="80"/>
-        <w:ind w:firstLine="0"/>
       </w:pPr>
       <w:r>
         <w:rPr>
@@ -5069,7 +4721,6 @@
     <w:p>
       <w:pPr>
         <w:spacing w:before="80" w:after="80"/>
-        <w:ind w:firstLine="0"/>
       </w:pPr>
       <w:r>
         <w:rPr>
@@ -5102,13 +4753,12 @@
           <w:i w:val="0"/>
           <w:sz w:val="20"/>
         </w:rPr>
-        <w:t>Rate Limiting Test (Login Scenario):</w:t>
+        <w:t>Rate Limiting Test (150 rapid requests):</w:t>
       </w:r>
     </w:p>
     <w:p>
       <w:pPr>
         <w:spacing w:before="80" w:after="80"/>
-        <w:ind w:firstLine="0"/>
       </w:pPr>
       <w:r>
         <w:rPr>

</xml_diff>

<commit_message>
fix: correct 7 reference errors in research report
- [1] Fix GitHub blog post title to actual published title
- [4] Fix BaxBench author list (Vero, Mundler, Chibotaru et al.)
- [5] CyberSecEval: correct venue to arXiv preprint, add Purple Llama
- [8] Fix author name: Guber -> Gupta
- [17] Fix Khoury page range: 2450 -> 2451
- [18] CyberSecEval 2: correct venue to arXiv preprint
- Remove fabricated Siddiq MSR 2024 reference
</commit_message>
<xml_diff>
--- a/CodeStrike_Research_Report.docx
+++ b/CodeStrike_Research_Report.docx
@@ -398,7 +398,7 @@
           <w:i w:val="0"/>
           <w:sz w:val="20"/>
         </w:rPr>
-        <w:t>He et al. [4] introduced BaxBench at ICML 2025 as the first end-to-end benchmark for AI-generated web application security. The key innovation was generating complete, runnable applications—not just code snippets—and testing them dynamically in Docker containers. BaxBench covered 28 scenarios and 23 CWEs across three frameworks. Our work builds directly on their framework, extending it with additional scenarios, vulnerability types, and the three-layer validation approach that is the central contribution of this paper.</w:t>
+        <w:t>Vero et al. [4] introduced BaxBench at ICML 2025 as the first end-to-end benchmark for AI-generated web application security. The key innovation was generating complete, runnable applications—not just code snippets—and testing them dynamically in Docker containers. BaxBench covered 28 scenarios and 23 CWEs across three frameworks. Our work builds directly on their framework, extending it with additional scenarios, vulnerability types, and the three-layer validation approach that is the central contribution of this paper.</w:t>
       </w:r>
     </w:p>
     <w:p>
@@ -4296,7 +4296,7 @@
           <w:i w:val="0"/>
           <w:sz w:val="16"/>
         </w:rPr>
-        <w:t>[1] GitHub, "Octoverse 2024: The state of open source and AI," GitHub Blog, Oct. 2024. [Online]. Available: https://github.blog/news-insights/octoverse/octoverse-2024/</w:t>
+        <w:t>[1] GitHub, "Octoverse 2024: AI leads Python to top language as the number of global developers surges," GitHub Blog, Oct. 2024. [Online]. Available: https://github.blog/news-insights/octoverse/octoverse-2024/</w:t>
       </w:r>
     </w:p>
     <w:p>
@@ -4341,7 +4341,7 @@
           <w:i w:val="0"/>
           <w:sz w:val="16"/>
         </w:rPr>
-        <w:t>[4] M. Vero, M. Müller, M. Fischer, and M. Vechev, "BaxBench: Can LLMs generate correct and secure backends?" in Proc. Int. Conf. Machine Learning (ICML), 2025. [Online]. Available: https://arxiv.org/abs/2502.11844</w:t>
+        <w:t>[4] M. Vero, N. Mundler, V. Chibotaru, V. Raychev, M. Baader, N. Jovanovic, J. He, and M. Vechev, "BaxBench: Can LLMs generate correct and secure backends?" in Proc. Int. Conf. Machine Learning (ICML), 2025. [Online]. Available: https://arxiv.org/abs/2502.11844</w:t>
       </w:r>
     </w:p>
     <w:p>
@@ -4356,7 +4356,7 @@
           <w:i w:val="0"/>
           <w:sz w:val="16"/>
         </w:rPr>
-        <w:t>[5] M. Bhatt et al., "CyberSecEval: A secure coding benchmark for language models," Meta AI, Dec. 2023. [Online]. Available: https://arxiv.org/abs/2312.04724</w:t>
+        <w:t>[5] M. Bhatt et al., "Purple Llama CyberSecEval: A secure coding benchmark for language models," arXiv preprint arXiv:2312.04724, Dec. 2023. [Online]. Available: https://arxiv.org/abs/2312.04724</w:t>
       </w:r>
     </w:p>
     <w:p>
@@ -4401,7 +4401,7 @@
           <w:i w:val="0"/>
           <w:sz w:val="16"/>
         </w:rPr>
-        <w:t>[8] J. Bau, E. Bursztein, D. Guber, and J. Mitchell, "State of the art: Automated black-box web application vulnerability testing," in Proc. IEEE Symp. Security and Privacy (S&amp;P), Oakland, CA, USA, May 2010, pp. 332–345. doi: 10.1109/SP.2010.27</w:t>
+        <w:t>[8] J. Bau, E. Bursztein, D. Gupta, and J. Mitchell, "State of the art: Automated black-box web application vulnerability testing," in Proc. IEEE Symp. Security and Privacy (S&amp;P), Oakland, CA, USA, May 2010, pp. 332–345. doi: 10.1109/SP.2010.27</w:t>
       </w:r>
     </w:p>
     <w:p>
@@ -4536,7 +4536,7 @@
           <w:i w:val="0"/>
           <w:sz w:val="16"/>
         </w:rPr>
-        <w:t>[17] R. Khoury, A. R. Avon, J. Whittaker, and G. Neto, "How secure is code generated by ChatGPT?" in Proc. IEEE Int. Conf. Systems, Man, and Cybernetics (SMC), Honolulu, HI, USA, Oct. 2023, pp. 2445–2450. doi: 10.1109/SMC53992.2023.10394237</w:t>
+        <w:t>[17] R. Khoury, A. R. Avon, J. Whittaker, and G. Neto, "How secure is code generated by ChatGPT?" in Proc. IEEE Int. Conf. Systems, Man, and Cybernetics (SMC), Honolulu, HI, USA, Oct. 2023, pp. 2445–2451. doi: 10.1109/SMC53992.2023.10394237</w:t>
       </w:r>
     </w:p>
     <w:p>
@@ -4551,7 +4551,7 @@
           <w:i w:val="0"/>
           <w:sz w:val="16"/>
         </w:rPr>
-        <w:t>[18] M. Bhatt et al., "CyberSecEval 2: A wide-ranging cybersecurity evaluation suite for large language models," Meta AI, Apr. 2024. [Online]. Available: https://arxiv.org/abs/2404.13161</w:t>
+        <w:t>[18] M. Bhatt et al., "CyberSecEval 2: A wide-ranging cybersecurity evaluation suite for large language models," arXiv preprint arXiv:2404.13161, Apr. 2024. [Online]. Available: https://arxiv.org/abs/2404.13161</w:t>
       </w:r>
     </w:p>
     <w:p>

</xml_diff>